<commit_message>
Left-align answer option text; keep header cells centered
Co-authored-by: arena-agent <297053741+arena-agent@users.noreply.github.com>
</commit_message>
<xml_diff>
--- a/quiz.docx
+++ b/quiz.docx
@@ -121,7 +121,7 @@
           <w:p>
             <w:pPr>
               <w:spacing w:line="240" w:lineRule="auto" w:before="0" w:after="0"/>
-              <w:jc w:val="center"/>
+              <w:jc w:val="left"/>
             </w:pPr>
             <w:r/>
             <w:r>
@@ -184,7 +184,7 @@
           <w:p>
             <w:pPr>
               <w:spacing w:line="240" w:lineRule="auto" w:before="0" w:after="0"/>
-              <w:jc w:val="center"/>
+              <w:jc w:val="left"/>
             </w:pPr>
             <w:r/>
             <w:r>
@@ -247,7 +247,7 @@
           <w:p>
             <w:pPr>
               <w:spacing w:line="240" w:lineRule="auto" w:before="0" w:after="0"/>
-              <w:jc w:val="center"/>
+              <w:jc w:val="left"/>
             </w:pPr>
             <w:r/>
             <w:r>
@@ -401,7 +401,7 @@
           <w:p>
             <w:pPr>
               <w:spacing w:line="240" w:lineRule="auto" w:before="0" w:after="0"/>
-              <w:jc w:val="center"/>
+              <w:jc w:val="left"/>
             </w:pPr>
             <w:r/>
             <w:r>
@@ -464,7 +464,7 @@
           <w:p>
             <w:pPr>
               <w:spacing w:line="240" w:lineRule="auto" w:before="0" w:after="0"/>
-              <w:jc w:val="center"/>
+              <w:jc w:val="left"/>
             </w:pPr>
             <w:r/>
             <w:r>
@@ -527,7 +527,7 @@
           <w:p>
             <w:pPr>
               <w:spacing w:line="240" w:lineRule="auto" w:before="0" w:after="0"/>
-              <w:jc w:val="center"/>
+              <w:jc w:val="left"/>
             </w:pPr>
             <w:r/>
             <w:r>
@@ -681,7 +681,7 @@
           <w:p>
             <w:pPr>
               <w:spacing w:line="240" w:lineRule="auto" w:before="0" w:after="0"/>
-              <w:jc w:val="center"/>
+              <w:jc w:val="left"/>
             </w:pPr>
             <w:r/>
             <w:r>
@@ -744,7 +744,7 @@
           <w:p>
             <w:pPr>
               <w:spacing w:line="240" w:lineRule="auto" w:before="0" w:after="0"/>
-              <w:jc w:val="center"/>
+              <w:jc w:val="left"/>
             </w:pPr>
             <w:r/>
             <w:r>
@@ -807,7 +807,7 @@
           <w:p>
             <w:pPr>
               <w:spacing w:line="240" w:lineRule="auto" w:before="0" w:after="0"/>
-              <w:jc w:val="center"/>
+              <w:jc w:val="left"/>
             </w:pPr>
             <w:r/>
             <w:r>
@@ -961,7 +961,7 @@
           <w:p>
             <w:pPr>
               <w:spacing w:line="240" w:lineRule="auto" w:before="0" w:after="0"/>
-              <w:jc w:val="center"/>
+              <w:jc w:val="left"/>
             </w:pPr>
             <w:r/>
             <w:r>
@@ -1024,7 +1024,7 @@
           <w:p>
             <w:pPr>
               <w:spacing w:line="240" w:lineRule="auto" w:before="0" w:after="0"/>
-              <w:jc w:val="center"/>
+              <w:jc w:val="left"/>
             </w:pPr>
             <w:r/>
             <w:r>
@@ -1087,7 +1087,7 @@
           <w:p>
             <w:pPr>
               <w:spacing w:line="240" w:lineRule="auto" w:before="0" w:after="0"/>
-              <w:jc w:val="center"/>
+              <w:jc w:val="left"/>
             </w:pPr>
             <w:r/>
             <w:r>
@@ -1241,7 +1241,7 @@
           <w:p>
             <w:pPr>
               <w:spacing w:line="240" w:lineRule="auto" w:before="0" w:after="0"/>
-              <w:jc w:val="center"/>
+              <w:jc w:val="left"/>
             </w:pPr>
             <w:r/>
             <w:r>
@@ -1304,7 +1304,7 @@
           <w:p>
             <w:pPr>
               <w:spacing w:line="240" w:lineRule="auto" w:before="0" w:after="0"/>
-              <w:jc w:val="center"/>
+              <w:jc w:val="left"/>
             </w:pPr>
             <w:r/>
             <w:r>
@@ -1367,7 +1367,7 @@
           <w:p>
             <w:pPr>
               <w:spacing w:line="240" w:lineRule="auto" w:before="0" w:after="0"/>
-              <w:jc w:val="center"/>
+              <w:jc w:val="left"/>
             </w:pPr>
             <w:r/>
             <w:r>
@@ -1521,7 +1521,7 @@
           <w:p>
             <w:pPr>
               <w:spacing w:line="240" w:lineRule="auto" w:before="0" w:after="0"/>
-              <w:jc w:val="center"/>
+              <w:jc w:val="left"/>
             </w:pPr>
             <w:r/>
             <w:r>
@@ -1584,7 +1584,7 @@
           <w:p>
             <w:pPr>
               <w:spacing w:line="240" w:lineRule="auto" w:before="0" w:after="0"/>
-              <w:jc w:val="center"/>
+              <w:jc w:val="left"/>
             </w:pPr>
             <w:r/>
             <w:r>
@@ -1647,7 +1647,7 @@
           <w:p>
             <w:pPr>
               <w:spacing w:line="240" w:lineRule="auto" w:before="0" w:after="0"/>
-              <w:jc w:val="center"/>
+              <w:jc w:val="left"/>
             </w:pPr>
             <w:r/>
             <w:r>
@@ -1801,7 +1801,7 @@
           <w:p>
             <w:pPr>
               <w:spacing w:line="240" w:lineRule="auto" w:before="0" w:after="0"/>
-              <w:jc w:val="center"/>
+              <w:jc w:val="left"/>
             </w:pPr>
             <w:r/>
             <w:r>
@@ -1864,7 +1864,7 @@
           <w:p>
             <w:pPr>
               <w:spacing w:line="240" w:lineRule="auto" w:before="0" w:after="0"/>
-              <w:jc w:val="center"/>
+              <w:jc w:val="left"/>
             </w:pPr>
             <w:r/>
             <w:r>
@@ -1927,7 +1927,7 @@
           <w:p>
             <w:pPr>
               <w:spacing w:line="240" w:lineRule="auto" w:before="0" w:after="0"/>
-              <w:jc w:val="center"/>
+              <w:jc w:val="left"/>
             </w:pPr>
             <w:r/>
             <w:r>
@@ -2081,7 +2081,7 @@
           <w:p>
             <w:pPr>
               <w:spacing w:line="240" w:lineRule="auto" w:before="0" w:after="0"/>
-              <w:jc w:val="center"/>
+              <w:jc w:val="left"/>
             </w:pPr>
             <w:r/>
             <w:r>
@@ -2144,7 +2144,7 @@
           <w:p>
             <w:pPr>
               <w:spacing w:line="240" w:lineRule="auto" w:before="0" w:after="0"/>
-              <w:jc w:val="center"/>
+              <w:jc w:val="left"/>
             </w:pPr>
             <w:r/>
             <w:r>
@@ -2207,7 +2207,7 @@
           <w:p>
             <w:pPr>
               <w:spacing w:line="240" w:lineRule="auto" w:before="0" w:after="0"/>
-              <w:jc w:val="center"/>
+              <w:jc w:val="left"/>
             </w:pPr>
             <w:r/>
             <w:r>
@@ -2361,7 +2361,7 @@
           <w:p>
             <w:pPr>
               <w:spacing w:line="240" w:lineRule="auto" w:before="0" w:after="0"/>
-              <w:jc w:val="center"/>
+              <w:jc w:val="left"/>
             </w:pPr>
             <w:r/>
             <w:r>
@@ -2424,7 +2424,7 @@
           <w:p>
             <w:pPr>
               <w:spacing w:line="240" w:lineRule="auto" w:before="0" w:after="0"/>
-              <w:jc w:val="center"/>
+              <w:jc w:val="left"/>
             </w:pPr>
             <w:r/>
             <w:r>
@@ -2487,7 +2487,7 @@
           <w:p>
             <w:pPr>
               <w:spacing w:line="240" w:lineRule="auto" w:before="0" w:after="0"/>
-              <w:jc w:val="center"/>
+              <w:jc w:val="left"/>
             </w:pPr>
             <w:r/>
             <w:r>
@@ -2641,7 +2641,7 @@
           <w:p>
             <w:pPr>
               <w:spacing w:line="240" w:lineRule="auto" w:before="0" w:after="0"/>
-              <w:jc w:val="center"/>
+              <w:jc w:val="left"/>
             </w:pPr>
             <w:r/>
             <w:r>
@@ -2704,7 +2704,7 @@
           <w:p>
             <w:pPr>
               <w:spacing w:line="240" w:lineRule="auto" w:before="0" w:after="0"/>
-              <w:jc w:val="center"/>
+              <w:jc w:val="left"/>
             </w:pPr>
             <w:r/>
             <w:r>
@@ -2767,7 +2767,7 @@
           <w:p>
             <w:pPr>
               <w:spacing w:line="240" w:lineRule="auto" w:before="0" w:after="0"/>
-              <w:jc w:val="center"/>
+              <w:jc w:val="left"/>
             </w:pPr>
             <w:r/>
             <w:r>
@@ -2921,7 +2921,7 @@
           <w:p>
             <w:pPr>
               <w:spacing w:line="240" w:lineRule="auto" w:before="0" w:after="0"/>
-              <w:jc w:val="center"/>
+              <w:jc w:val="left"/>
             </w:pPr>
             <w:r/>
             <w:r>
@@ -2984,7 +2984,7 @@
           <w:p>
             <w:pPr>
               <w:spacing w:line="240" w:lineRule="auto" w:before="0" w:after="0"/>
-              <w:jc w:val="center"/>
+              <w:jc w:val="left"/>
             </w:pPr>
             <w:r/>
             <w:r>
@@ -3047,7 +3047,7 @@
           <w:p>
             <w:pPr>
               <w:spacing w:line="240" w:lineRule="auto" w:before="0" w:after="0"/>
-              <w:jc w:val="center"/>
+              <w:jc w:val="left"/>
             </w:pPr>
             <w:r/>
             <w:r>
@@ -3201,7 +3201,7 @@
           <w:p>
             <w:pPr>
               <w:spacing w:line="240" w:lineRule="auto" w:before="0" w:after="0"/>
-              <w:jc w:val="center"/>
+              <w:jc w:val="left"/>
             </w:pPr>
             <w:r/>
             <w:r>
@@ -3264,7 +3264,7 @@
           <w:p>
             <w:pPr>
               <w:spacing w:line="240" w:lineRule="auto" w:before="0" w:after="0"/>
-              <w:jc w:val="center"/>
+              <w:jc w:val="left"/>
             </w:pPr>
             <w:r/>
             <w:r>
@@ -3327,7 +3327,7 @@
           <w:p>
             <w:pPr>
               <w:spacing w:line="240" w:lineRule="auto" w:before="0" w:after="0"/>
-              <w:jc w:val="center"/>
+              <w:jc w:val="left"/>
             </w:pPr>
             <w:r/>
             <w:r>
@@ -3481,7 +3481,7 @@
           <w:p>
             <w:pPr>
               <w:spacing w:line="240" w:lineRule="auto" w:before="0" w:after="0"/>
-              <w:jc w:val="center"/>
+              <w:jc w:val="left"/>
             </w:pPr>
             <w:r/>
             <w:r>
@@ -3544,7 +3544,7 @@
           <w:p>
             <w:pPr>
               <w:spacing w:line="240" w:lineRule="auto" w:before="0" w:after="0"/>
-              <w:jc w:val="center"/>
+              <w:jc w:val="left"/>
             </w:pPr>
             <w:r/>
             <w:r>
@@ -3607,7 +3607,7 @@
           <w:p>
             <w:pPr>
               <w:spacing w:line="240" w:lineRule="auto" w:before="0" w:after="0"/>
-              <w:jc w:val="center"/>
+              <w:jc w:val="left"/>
             </w:pPr>
             <w:r/>
             <w:r>
@@ -3761,7 +3761,7 @@
           <w:p>
             <w:pPr>
               <w:spacing w:line="240" w:lineRule="auto" w:before="0" w:after="0"/>
-              <w:jc w:val="center"/>
+              <w:jc w:val="left"/>
             </w:pPr>
             <w:r/>
             <w:r>
@@ -3824,7 +3824,7 @@
           <w:p>
             <w:pPr>
               <w:spacing w:line="240" w:lineRule="auto" w:before="0" w:after="0"/>
-              <w:jc w:val="center"/>
+              <w:jc w:val="left"/>
             </w:pPr>
             <w:r/>
             <w:r>
@@ -3887,7 +3887,7 @@
           <w:p>
             <w:pPr>
               <w:spacing w:line="240" w:lineRule="auto" w:before="0" w:after="0"/>
-              <w:jc w:val="center"/>
+              <w:jc w:val="left"/>
             </w:pPr>
             <w:r/>
             <w:r>
@@ -4041,7 +4041,7 @@
           <w:p>
             <w:pPr>
               <w:spacing w:line="240" w:lineRule="auto" w:before="0" w:after="0"/>
-              <w:jc w:val="center"/>
+              <w:jc w:val="left"/>
             </w:pPr>
             <w:r/>
             <w:r>
@@ -4104,7 +4104,7 @@
           <w:p>
             <w:pPr>
               <w:spacing w:line="240" w:lineRule="auto" w:before="0" w:after="0"/>
-              <w:jc w:val="center"/>
+              <w:jc w:val="left"/>
             </w:pPr>
             <w:r/>
             <w:r>
@@ -4167,7 +4167,7 @@
           <w:p>
             <w:pPr>
               <w:spacing w:line="240" w:lineRule="auto" w:before="0" w:after="0"/>
-              <w:jc w:val="center"/>
+              <w:jc w:val="left"/>
             </w:pPr>
             <w:r/>
             <w:r>
@@ -4321,7 +4321,7 @@
           <w:p>
             <w:pPr>
               <w:spacing w:line="240" w:lineRule="auto" w:before="0" w:after="0"/>
-              <w:jc w:val="center"/>
+              <w:jc w:val="left"/>
             </w:pPr>
             <w:r/>
             <w:r>
@@ -4384,7 +4384,7 @@
           <w:p>
             <w:pPr>
               <w:spacing w:line="240" w:lineRule="auto" w:before="0" w:after="0"/>
-              <w:jc w:val="center"/>
+              <w:jc w:val="left"/>
             </w:pPr>
             <w:r/>
             <w:r>
@@ -4447,7 +4447,7 @@
           <w:p>
             <w:pPr>
               <w:spacing w:line="240" w:lineRule="auto" w:before="0" w:after="0"/>
-              <w:jc w:val="center"/>
+              <w:jc w:val="left"/>
             </w:pPr>
             <w:r/>
             <w:r>
@@ -4601,7 +4601,7 @@
           <w:p>
             <w:pPr>
               <w:spacing w:line="240" w:lineRule="auto" w:before="0" w:after="0"/>
-              <w:jc w:val="center"/>
+              <w:jc w:val="left"/>
             </w:pPr>
             <w:r/>
             <w:r>
@@ -4664,7 +4664,7 @@
           <w:p>
             <w:pPr>
               <w:spacing w:line="240" w:lineRule="auto" w:before="0" w:after="0"/>
-              <w:jc w:val="center"/>
+              <w:jc w:val="left"/>
             </w:pPr>
             <w:r/>
             <w:r>
@@ -4727,7 +4727,7 @@
           <w:p>
             <w:pPr>
               <w:spacing w:line="240" w:lineRule="auto" w:before="0" w:after="0"/>
-              <w:jc w:val="center"/>
+              <w:jc w:val="left"/>
             </w:pPr>
             <w:r/>
             <w:r>
@@ -4881,7 +4881,7 @@
           <w:p>
             <w:pPr>
               <w:spacing w:line="240" w:lineRule="auto" w:before="0" w:after="0"/>
-              <w:jc w:val="center"/>
+              <w:jc w:val="left"/>
             </w:pPr>
             <w:r/>
             <w:r>
@@ -4944,7 +4944,7 @@
           <w:p>
             <w:pPr>
               <w:spacing w:line="240" w:lineRule="auto" w:before="0" w:after="0"/>
-              <w:jc w:val="center"/>
+              <w:jc w:val="left"/>
             </w:pPr>
             <w:r/>
             <w:r>
@@ -5007,7 +5007,7 @@
           <w:p>
             <w:pPr>
               <w:spacing w:line="240" w:lineRule="auto" w:before="0" w:after="0"/>
-              <w:jc w:val="center"/>
+              <w:jc w:val="left"/>
             </w:pPr>
             <w:r/>
             <w:r>
@@ -5161,7 +5161,7 @@
           <w:p>
             <w:pPr>
               <w:spacing w:line="240" w:lineRule="auto" w:before="0" w:after="0"/>
-              <w:jc w:val="center"/>
+              <w:jc w:val="left"/>
             </w:pPr>
             <w:r/>
             <w:r>
@@ -5224,7 +5224,7 @@
           <w:p>
             <w:pPr>
               <w:spacing w:line="240" w:lineRule="auto" w:before="0" w:after="0"/>
-              <w:jc w:val="center"/>
+              <w:jc w:val="left"/>
             </w:pPr>
             <w:r/>
             <w:r>
@@ -5287,7 +5287,7 @@
           <w:p>
             <w:pPr>
               <w:spacing w:line="240" w:lineRule="auto" w:before="0" w:after="0"/>
-              <w:jc w:val="center"/>
+              <w:jc w:val="left"/>
             </w:pPr>
             <w:r/>
             <w:r>
@@ -5441,7 +5441,7 @@
           <w:p>
             <w:pPr>
               <w:spacing w:line="240" w:lineRule="auto" w:before="0" w:after="0"/>
-              <w:jc w:val="center"/>
+              <w:jc w:val="left"/>
             </w:pPr>
             <w:r/>
             <w:r>
@@ -5504,7 +5504,7 @@
           <w:p>
             <w:pPr>
               <w:spacing w:line="240" w:lineRule="auto" w:before="0" w:after="0"/>
-              <w:jc w:val="center"/>
+              <w:jc w:val="left"/>
             </w:pPr>
             <w:r/>
             <w:r>
@@ -5567,7 +5567,7 @@
           <w:p>
             <w:pPr>
               <w:spacing w:line="240" w:lineRule="auto" w:before="0" w:after="0"/>
-              <w:jc w:val="center"/>
+              <w:jc w:val="left"/>
             </w:pPr>
             <w:r/>
             <w:r>
@@ -5721,7 +5721,7 @@
           <w:p>
             <w:pPr>
               <w:spacing w:line="240" w:lineRule="auto" w:before="0" w:after="0"/>
-              <w:jc w:val="center"/>
+              <w:jc w:val="left"/>
             </w:pPr>
             <w:r/>
             <w:r>
@@ -5784,7 +5784,7 @@
           <w:p>
             <w:pPr>
               <w:spacing w:line="240" w:lineRule="auto" w:before="0" w:after="0"/>
-              <w:jc w:val="center"/>
+              <w:jc w:val="left"/>
             </w:pPr>
             <w:r/>
             <w:r>
@@ -5847,7 +5847,7 @@
           <w:p>
             <w:pPr>
               <w:spacing w:line="240" w:lineRule="auto" w:before="0" w:after="0"/>
-              <w:jc w:val="center"/>
+              <w:jc w:val="left"/>
             </w:pPr>
             <w:r/>
             <w:r>
@@ -6001,7 +6001,7 @@
           <w:p>
             <w:pPr>
               <w:spacing w:line="240" w:lineRule="auto" w:before="0" w:after="0"/>
-              <w:jc w:val="center"/>
+              <w:jc w:val="left"/>
             </w:pPr>
             <w:r/>
             <w:r>
@@ -6064,7 +6064,7 @@
           <w:p>
             <w:pPr>
               <w:spacing w:line="240" w:lineRule="auto" w:before="0" w:after="0"/>
-              <w:jc w:val="center"/>
+              <w:jc w:val="left"/>
             </w:pPr>
             <w:r/>
             <w:r>
@@ -6127,7 +6127,7 @@
           <w:p>
             <w:pPr>
               <w:spacing w:line="240" w:lineRule="auto" w:before="0" w:after="0"/>
-              <w:jc w:val="center"/>
+              <w:jc w:val="left"/>
             </w:pPr>
             <w:r/>
             <w:r>
@@ -6281,7 +6281,7 @@
           <w:p>
             <w:pPr>
               <w:spacing w:line="240" w:lineRule="auto" w:before="0" w:after="0"/>
-              <w:jc w:val="center"/>
+              <w:jc w:val="left"/>
             </w:pPr>
             <w:r/>
             <w:r>
@@ -6344,7 +6344,7 @@
           <w:p>
             <w:pPr>
               <w:spacing w:line="240" w:lineRule="auto" w:before="0" w:after="0"/>
-              <w:jc w:val="center"/>
+              <w:jc w:val="left"/>
             </w:pPr>
             <w:r/>
             <w:r>
@@ -6407,7 +6407,7 @@
           <w:p>
             <w:pPr>
               <w:spacing w:line="240" w:lineRule="auto" w:before="0" w:after="0"/>
-              <w:jc w:val="center"/>
+              <w:jc w:val="left"/>
             </w:pPr>
             <w:r/>
             <w:r>
@@ -6561,7 +6561,7 @@
           <w:p>
             <w:pPr>
               <w:spacing w:line="240" w:lineRule="auto" w:before="0" w:after="0"/>
-              <w:jc w:val="center"/>
+              <w:jc w:val="left"/>
             </w:pPr>
             <w:r/>
             <w:r>
@@ -6624,7 +6624,7 @@
           <w:p>
             <w:pPr>
               <w:spacing w:line="240" w:lineRule="auto" w:before="0" w:after="0"/>
-              <w:jc w:val="center"/>
+              <w:jc w:val="left"/>
             </w:pPr>
             <w:r/>
             <w:r>
@@ -6687,7 +6687,7 @@
           <w:p>
             <w:pPr>
               <w:spacing w:line="240" w:lineRule="auto" w:before="0" w:after="0"/>
-              <w:jc w:val="center"/>
+              <w:jc w:val="left"/>
             </w:pPr>
             <w:r/>
             <w:r>
@@ -6841,7 +6841,7 @@
           <w:p>
             <w:pPr>
               <w:spacing w:line="240" w:lineRule="auto" w:before="0" w:after="0"/>
-              <w:jc w:val="center"/>
+              <w:jc w:val="left"/>
             </w:pPr>
             <w:r/>
             <w:r>
@@ -6904,7 +6904,7 @@
           <w:p>
             <w:pPr>
               <w:spacing w:line="240" w:lineRule="auto" w:before="0" w:after="0"/>
-              <w:jc w:val="center"/>
+              <w:jc w:val="left"/>
             </w:pPr>
             <w:r/>
             <w:r>
@@ -6967,7 +6967,7 @@
           <w:p>
             <w:pPr>
               <w:spacing w:line="240" w:lineRule="auto" w:before="0" w:after="0"/>
-              <w:jc w:val="center"/>
+              <w:jc w:val="left"/>
             </w:pPr>
             <w:r/>
             <w:r>
@@ -7121,7 +7121,7 @@
           <w:p>
             <w:pPr>
               <w:spacing w:line="240" w:lineRule="auto" w:before="0" w:after="0"/>
-              <w:jc w:val="center"/>
+              <w:jc w:val="left"/>
             </w:pPr>
             <w:r/>
             <w:r>
@@ -7184,7 +7184,7 @@
           <w:p>
             <w:pPr>
               <w:spacing w:line="240" w:lineRule="auto" w:before="0" w:after="0"/>
-              <w:jc w:val="center"/>
+              <w:jc w:val="left"/>
             </w:pPr>
             <w:r/>
             <w:r>
@@ -7247,7 +7247,7 @@
           <w:p>
             <w:pPr>
               <w:spacing w:line="240" w:lineRule="auto" w:before="0" w:after="0"/>
-              <w:jc w:val="center"/>
+              <w:jc w:val="left"/>
             </w:pPr>
             <w:r/>
             <w:r>
@@ -7401,7 +7401,7 @@
           <w:p>
             <w:pPr>
               <w:spacing w:line="240" w:lineRule="auto" w:before="0" w:after="0"/>
-              <w:jc w:val="center"/>
+              <w:jc w:val="left"/>
             </w:pPr>
             <w:r/>
             <w:r>
@@ -7464,7 +7464,7 @@
           <w:p>
             <w:pPr>
               <w:spacing w:line="240" w:lineRule="auto" w:before="0" w:after="0"/>
-              <w:jc w:val="center"/>
+              <w:jc w:val="left"/>
             </w:pPr>
             <w:r/>
             <w:r>
@@ -7527,7 +7527,7 @@
           <w:p>
             <w:pPr>
               <w:spacing w:line="240" w:lineRule="auto" w:before="0" w:after="0"/>
-              <w:jc w:val="center"/>
+              <w:jc w:val="left"/>
             </w:pPr>
             <w:r/>
             <w:r>
@@ -7681,7 +7681,7 @@
           <w:p>
             <w:pPr>
               <w:spacing w:line="240" w:lineRule="auto" w:before="0" w:after="0"/>
-              <w:jc w:val="center"/>
+              <w:jc w:val="left"/>
             </w:pPr>
             <w:r/>
             <w:r>
@@ -7744,7 +7744,7 @@
           <w:p>
             <w:pPr>
               <w:spacing w:line="240" w:lineRule="auto" w:before="0" w:after="0"/>
-              <w:jc w:val="center"/>
+              <w:jc w:val="left"/>
             </w:pPr>
             <w:r/>
             <w:r>
@@ -7807,7 +7807,7 @@
           <w:p>
             <w:pPr>
               <w:spacing w:line="240" w:lineRule="auto" w:before="0" w:after="0"/>
-              <w:jc w:val="center"/>
+              <w:jc w:val="left"/>
             </w:pPr>
             <w:r/>
             <w:r>
@@ -7961,7 +7961,7 @@
           <w:p>
             <w:pPr>
               <w:spacing w:line="240" w:lineRule="auto" w:before="0" w:after="0"/>
-              <w:jc w:val="center"/>
+              <w:jc w:val="left"/>
             </w:pPr>
             <w:r/>
             <w:r>
@@ -8024,7 +8024,7 @@
           <w:p>
             <w:pPr>
               <w:spacing w:line="240" w:lineRule="auto" w:before="0" w:after="0"/>
-              <w:jc w:val="center"/>
+              <w:jc w:val="left"/>
             </w:pPr>
             <w:r/>
             <w:r>
@@ -8087,7 +8087,7 @@
           <w:p>
             <w:pPr>
               <w:spacing w:line="240" w:lineRule="auto" w:before="0" w:after="0"/>
-              <w:jc w:val="center"/>
+              <w:jc w:val="left"/>
             </w:pPr>
             <w:r/>
             <w:r>
@@ -8241,7 +8241,7 @@
           <w:p>
             <w:pPr>
               <w:spacing w:line="240" w:lineRule="auto" w:before="0" w:after="0"/>
-              <w:jc w:val="center"/>
+              <w:jc w:val="left"/>
             </w:pPr>
             <w:r/>
             <w:r>
@@ -8304,7 +8304,7 @@
           <w:p>
             <w:pPr>
               <w:spacing w:line="240" w:lineRule="auto" w:before="0" w:after="0"/>
-              <w:jc w:val="center"/>
+              <w:jc w:val="left"/>
             </w:pPr>
             <w:r/>
             <w:r>
@@ -8367,7 +8367,7 @@
           <w:p>
             <w:pPr>
               <w:spacing w:line="240" w:lineRule="auto" w:before="0" w:after="0"/>
-              <w:jc w:val="center"/>
+              <w:jc w:val="left"/>
             </w:pPr>
             <w:r/>
             <w:r>
@@ -8521,7 +8521,7 @@
           <w:p>
             <w:pPr>
               <w:spacing w:line="240" w:lineRule="auto" w:before="0" w:after="0"/>
-              <w:jc w:val="center"/>
+              <w:jc w:val="left"/>
             </w:pPr>
             <w:r/>
             <w:r>
@@ -8584,7 +8584,7 @@
           <w:p>
             <w:pPr>
               <w:spacing w:line="240" w:lineRule="auto" w:before="0" w:after="0"/>
-              <w:jc w:val="center"/>
+              <w:jc w:val="left"/>
             </w:pPr>
             <w:r/>
             <w:r>
@@ -8647,7 +8647,7 @@
           <w:p>
             <w:pPr>
               <w:spacing w:line="240" w:lineRule="auto" w:before="0" w:after="0"/>
-              <w:jc w:val="center"/>
+              <w:jc w:val="left"/>
             </w:pPr>
             <w:r/>
             <w:r>
@@ -8801,7 +8801,7 @@
           <w:p>
             <w:pPr>
               <w:spacing w:line="240" w:lineRule="auto" w:before="0" w:after="0"/>
-              <w:jc w:val="center"/>
+              <w:jc w:val="left"/>
             </w:pPr>
             <w:r/>
             <w:r>
@@ -8864,7 +8864,7 @@
           <w:p>
             <w:pPr>
               <w:spacing w:line="240" w:lineRule="auto" w:before="0" w:after="0"/>
-              <w:jc w:val="center"/>
+              <w:jc w:val="left"/>
             </w:pPr>
             <w:r/>
             <w:r>
@@ -8927,7 +8927,7 @@
           <w:p>
             <w:pPr>
               <w:spacing w:line="240" w:lineRule="auto" w:before="0" w:after="0"/>
-              <w:jc w:val="center"/>
+              <w:jc w:val="left"/>
             </w:pPr>
             <w:r/>
             <w:r>
@@ -9081,7 +9081,7 @@
           <w:p>
             <w:pPr>
               <w:spacing w:line="240" w:lineRule="auto" w:before="0" w:after="0"/>
-              <w:jc w:val="center"/>
+              <w:jc w:val="left"/>
             </w:pPr>
             <w:r/>
             <w:r>
@@ -9144,7 +9144,7 @@
           <w:p>
             <w:pPr>
               <w:spacing w:line="240" w:lineRule="auto" w:before="0" w:after="0"/>
-              <w:jc w:val="center"/>
+              <w:jc w:val="left"/>
             </w:pPr>
             <w:r/>
             <w:r>
@@ -9207,7 +9207,7 @@
           <w:p>
             <w:pPr>
               <w:spacing w:line="240" w:lineRule="auto" w:before="0" w:after="0"/>
-              <w:jc w:val="center"/>
+              <w:jc w:val="left"/>
             </w:pPr>
             <w:r/>
             <w:r>
@@ -9361,7 +9361,7 @@
           <w:p>
             <w:pPr>
               <w:spacing w:line="240" w:lineRule="auto" w:before="0" w:after="0"/>
-              <w:jc w:val="center"/>
+              <w:jc w:val="left"/>
             </w:pPr>
             <w:r/>
             <w:r>
@@ -9424,7 +9424,7 @@
           <w:p>
             <w:pPr>
               <w:spacing w:line="240" w:lineRule="auto" w:before="0" w:after="0"/>
-              <w:jc w:val="center"/>
+              <w:jc w:val="left"/>
             </w:pPr>
             <w:r/>
             <w:r>
@@ -9487,7 +9487,7 @@
           <w:p>
             <w:pPr>
               <w:spacing w:line="240" w:lineRule="auto" w:before="0" w:after="0"/>
-              <w:jc w:val="center"/>
+              <w:jc w:val="left"/>
             </w:pPr>
             <w:r/>
             <w:r>
@@ -9641,7 +9641,7 @@
           <w:p>
             <w:pPr>
               <w:spacing w:line="240" w:lineRule="auto" w:before="0" w:after="0"/>
-              <w:jc w:val="center"/>
+              <w:jc w:val="left"/>
             </w:pPr>
             <w:r/>
             <w:r>
@@ -9704,7 +9704,7 @@
           <w:p>
             <w:pPr>
               <w:spacing w:line="240" w:lineRule="auto" w:before="0" w:after="0"/>
-              <w:jc w:val="center"/>
+              <w:jc w:val="left"/>
             </w:pPr>
             <w:r/>
             <w:r>
@@ -9767,7 +9767,7 @@
           <w:p>
             <w:pPr>
               <w:spacing w:line="240" w:lineRule="auto" w:before="0" w:after="0"/>
-              <w:jc w:val="center"/>
+              <w:jc w:val="left"/>
             </w:pPr>
             <w:r/>
             <w:r>
@@ -9921,7 +9921,7 @@
           <w:p>
             <w:pPr>
               <w:spacing w:line="240" w:lineRule="auto" w:before="0" w:after="0"/>
-              <w:jc w:val="center"/>
+              <w:jc w:val="left"/>
             </w:pPr>
             <w:r/>
             <w:r>
@@ -9984,7 +9984,7 @@
           <w:p>
             <w:pPr>
               <w:spacing w:line="240" w:lineRule="auto" w:before="0" w:after="0"/>
-              <w:jc w:val="center"/>
+              <w:jc w:val="left"/>
             </w:pPr>
             <w:r/>
             <w:r>
@@ -10047,7 +10047,7 @@
           <w:p>
             <w:pPr>
               <w:spacing w:line="240" w:lineRule="auto" w:before="0" w:after="0"/>
-              <w:jc w:val="center"/>
+              <w:jc w:val="left"/>
             </w:pPr>
             <w:r/>
             <w:r>
@@ -10201,7 +10201,7 @@
           <w:p>
             <w:pPr>
               <w:spacing w:line="240" w:lineRule="auto" w:before="0" w:after="0"/>
-              <w:jc w:val="center"/>
+              <w:jc w:val="left"/>
             </w:pPr>
             <w:r/>
             <w:r>
@@ -10264,7 +10264,7 @@
           <w:p>
             <w:pPr>
               <w:spacing w:line="240" w:lineRule="auto" w:before="0" w:after="0"/>
-              <w:jc w:val="center"/>
+              <w:jc w:val="left"/>
             </w:pPr>
             <w:r/>
             <w:r>
@@ -10327,7 +10327,7 @@
           <w:p>
             <w:pPr>
               <w:spacing w:line="240" w:lineRule="auto" w:before="0" w:after="0"/>
-              <w:jc w:val="center"/>
+              <w:jc w:val="left"/>
             </w:pPr>
             <w:r/>
             <w:r>
@@ -10481,7 +10481,7 @@
           <w:p>
             <w:pPr>
               <w:spacing w:line="240" w:lineRule="auto" w:before="0" w:after="0"/>
-              <w:jc w:val="center"/>
+              <w:jc w:val="left"/>
             </w:pPr>
             <w:r/>
             <w:r>
@@ -10544,7 +10544,7 @@
           <w:p>
             <w:pPr>
               <w:spacing w:line="240" w:lineRule="auto" w:before="0" w:after="0"/>
-              <w:jc w:val="center"/>
+              <w:jc w:val="left"/>
             </w:pPr>
             <w:r/>
             <w:r>
@@ -10607,7 +10607,7 @@
           <w:p>
             <w:pPr>
               <w:spacing w:line="240" w:lineRule="auto" w:before="0" w:after="0"/>
-              <w:jc w:val="center"/>
+              <w:jc w:val="left"/>
             </w:pPr>
             <w:r/>
             <w:r>
@@ -10761,7 +10761,7 @@
           <w:p>
             <w:pPr>
               <w:spacing w:line="240" w:lineRule="auto" w:before="0" w:after="0"/>
-              <w:jc w:val="center"/>
+              <w:jc w:val="left"/>
             </w:pPr>
             <w:r/>
             <w:r>
@@ -10824,7 +10824,7 @@
           <w:p>
             <w:pPr>
               <w:spacing w:line="240" w:lineRule="auto" w:before="0" w:after="0"/>
-              <w:jc w:val="center"/>
+              <w:jc w:val="left"/>
             </w:pPr>
             <w:r/>
             <w:r>
@@ -10887,7 +10887,7 @@
           <w:p>
             <w:pPr>
               <w:spacing w:line="240" w:lineRule="auto" w:before="0" w:after="0"/>
-              <w:jc w:val="center"/>
+              <w:jc w:val="left"/>
             </w:pPr>
             <w:r/>
             <w:r>
@@ -11041,7 +11041,7 @@
           <w:p>
             <w:pPr>
               <w:spacing w:line="240" w:lineRule="auto" w:before="0" w:after="0"/>
-              <w:jc w:val="center"/>
+              <w:jc w:val="left"/>
             </w:pPr>
             <w:r/>
             <w:r>
@@ -11104,7 +11104,7 @@
           <w:p>
             <w:pPr>
               <w:spacing w:line="240" w:lineRule="auto" w:before="0" w:after="0"/>
-              <w:jc w:val="center"/>
+              <w:jc w:val="left"/>
             </w:pPr>
             <w:r/>
             <w:r>
@@ -11167,7 +11167,7 @@
           <w:p>
             <w:pPr>
               <w:spacing w:line="240" w:lineRule="auto" w:before="0" w:after="0"/>
-              <w:jc w:val="center"/>
+              <w:jc w:val="left"/>
             </w:pPr>
             <w:r/>
             <w:r>
@@ -11321,7 +11321,7 @@
           <w:p>
             <w:pPr>
               <w:spacing w:line="240" w:lineRule="auto" w:before="0" w:after="0"/>
-              <w:jc w:val="center"/>
+              <w:jc w:val="left"/>
             </w:pPr>
             <w:r/>
             <w:r>
@@ -11384,7 +11384,7 @@
           <w:p>
             <w:pPr>
               <w:spacing w:line="240" w:lineRule="auto" w:before="0" w:after="0"/>
-              <w:jc w:val="center"/>
+              <w:jc w:val="left"/>
             </w:pPr>
             <w:r/>
             <w:r>
@@ -11447,7 +11447,7 @@
           <w:p>
             <w:pPr>
               <w:spacing w:line="240" w:lineRule="auto" w:before="0" w:after="0"/>
-              <w:jc w:val="center"/>
+              <w:jc w:val="left"/>
             </w:pPr>
             <w:r/>
             <w:r>
@@ -11601,7 +11601,7 @@
           <w:p>
             <w:pPr>
               <w:spacing w:line="240" w:lineRule="auto" w:before="0" w:after="0"/>
-              <w:jc w:val="center"/>
+              <w:jc w:val="left"/>
             </w:pPr>
             <w:r/>
             <w:r>
@@ -11664,7 +11664,7 @@
           <w:p>
             <w:pPr>
               <w:spacing w:line="240" w:lineRule="auto" w:before="0" w:after="0"/>
-              <w:jc w:val="center"/>
+              <w:jc w:val="left"/>
             </w:pPr>
             <w:r/>
             <w:r>
@@ -11727,7 +11727,7 @@
           <w:p>
             <w:pPr>
               <w:spacing w:line="240" w:lineRule="auto" w:before="0" w:after="0"/>
-              <w:jc w:val="center"/>
+              <w:jc w:val="left"/>
             </w:pPr>
             <w:r/>
             <w:r>
@@ -11881,7 +11881,7 @@
           <w:p>
             <w:pPr>
               <w:spacing w:line="240" w:lineRule="auto" w:before="0" w:after="0"/>
-              <w:jc w:val="center"/>
+              <w:jc w:val="left"/>
             </w:pPr>
             <w:r/>
             <w:r>
@@ -11944,7 +11944,7 @@
           <w:p>
             <w:pPr>
               <w:spacing w:line="240" w:lineRule="auto" w:before="0" w:after="0"/>
-              <w:jc w:val="center"/>
+              <w:jc w:val="left"/>
             </w:pPr>
             <w:r/>
             <w:r>
@@ -12007,7 +12007,7 @@
           <w:p>
             <w:pPr>
               <w:spacing w:line="240" w:lineRule="auto" w:before="0" w:after="0"/>
-              <w:jc w:val="center"/>
+              <w:jc w:val="left"/>
             </w:pPr>
             <w:r/>
             <w:r>
@@ -12161,7 +12161,7 @@
           <w:p>
             <w:pPr>
               <w:spacing w:line="240" w:lineRule="auto" w:before="0" w:after="0"/>
-              <w:jc w:val="center"/>
+              <w:jc w:val="left"/>
             </w:pPr>
             <w:r/>
             <w:r>
@@ -12224,7 +12224,7 @@
           <w:p>
             <w:pPr>
               <w:spacing w:line="240" w:lineRule="auto" w:before="0" w:after="0"/>
-              <w:jc w:val="center"/>
+              <w:jc w:val="left"/>
             </w:pPr>
             <w:r/>
             <w:r>
@@ -12287,7 +12287,7 @@
           <w:p>
             <w:pPr>
               <w:spacing w:line="240" w:lineRule="auto" w:before="0" w:after="0"/>
-              <w:jc w:val="center"/>
+              <w:jc w:val="left"/>
             </w:pPr>
             <w:r/>
             <w:r>
@@ -12441,7 +12441,7 @@
           <w:p>
             <w:pPr>
               <w:spacing w:line="240" w:lineRule="auto" w:before="0" w:after="0"/>
-              <w:jc w:val="center"/>
+              <w:jc w:val="left"/>
             </w:pPr>
             <w:r/>
             <w:r>
@@ -12504,7 +12504,7 @@
           <w:p>
             <w:pPr>
               <w:spacing w:line="240" w:lineRule="auto" w:before="0" w:after="0"/>
-              <w:jc w:val="center"/>
+              <w:jc w:val="left"/>
             </w:pPr>
             <w:r/>
             <w:r>
@@ -12567,7 +12567,7 @@
           <w:p>
             <w:pPr>
               <w:spacing w:line="240" w:lineRule="auto" w:before="0" w:after="0"/>
-              <w:jc w:val="center"/>
+              <w:jc w:val="left"/>
             </w:pPr>
             <w:r/>
             <w:r>
@@ -12721,7 +12721,7 @@
           <w:p>
             <w:pPr>
               <w:spacing w:line="240" w:lineRule="auto" w:before="0" w:after="0"/>
-              <w:jc w:val="center"/>
+              <w:jc w:val="left"/>
             </w:pPr>
             <w:r/>
             <w:r>
@@ -12784,7 +12784,7 @@
           <w:p>
             <w:pPr>
               <w:spacing w:line="240" w:lineRule="auto" w:before="0" w:after="0"/>
-              <w:jc w:val="center"/>
+              <w:jc w:val="left"/>
             </w:pPr>
             <w:r/>
             <w:r>
@@ -12847,7 +12847,7 @@
           <w:p>
             <w:pPr>
               <w:spacing w:line="240" w:lineRule="auto" w:before="0" w:after="0"/>
-              <w:jc w:val="center"/>
+              <w:jc w:val="left"/>
             </w:pPr>
             <w:r/>
             <w:r>
@@ -13001,7 +13001,7 @@
           <w:p>
             <w:pPr>
               <w:spacing w:line="240" w:lineRule="auto" w:before="0" w:after="0"/>
-              <w:jc w:val="center"/>
+              <w:jc w:val="left"/>
             </w:pPr>
             <w:r/>
             <w:r>
@@ -13064,7 +13064,7 @@
           <w:p>
             <w:pPr>
               <w:spacing w:line="240" w:lineRule="auto" w:before="0" w:after="0"/>
-              <w:jc w:val="center"/>
+              <w:jc w:val="left"/>
             </w:pPr>
             <w:r/>
             <w:r>
@@ -13127,7 +13127,7 @@
           <w:p>
             <w:pPr>
               <w:spacing w:line="240" w:lineRule="auto" w:before="0" w:after="0"/>
-              <w:jc w:val="center"/>
+              <w:jc w:val="left"/>
             </w:pPr>
             <w:r/>
             <w:r>
@@ -13281,7 +13281,7 @@
           <w:p>
             <w:pPr>
               <w:spacing w:line="240" w:lineRule="auto" w:before="0" w:after="0"/>
-              <w:jc w:val="center"/>
+              <w:jc w:val="left"/>
             </w:pPr>
             <w:r/>
             <w:r>
@@ -13344,7 +13344,7 @@
           <w:p>
             <w:pPr>
               <w:spacing w:line="240" w:lineRule="auto" w:before="0" w:after="0"/>
-              <w:jc w:val="center"/>
+              <w:jc w:val="left"/>
             </w:pPr>
             <w:r/>
             <w:r>
@@ -13407,7 +13407,7 @@
           <w:p>
             <w:pPr>
               <w:spacing w:line="240" w:lineRule="auto" w:before="0" w:after="0"/>
-              <w:jc w:val="center"/>
+              <w:jc w:val="left"/>
             </w:pPr>
             <w:r/>
             <w:r>
@@ -13561,7 +13561,7 @@
           <w:p>
             <w:pPr>
               <w:spacing w:line="240" w:lineRule="auto" w:before="0" w:after="0"/>
-              <w:jc w:val="center"/>
+              <w:jc w:val="left"/>
             </w:pPr>
             <w:r/>
             <w:r>
@@ -13624,7 +13624,7 @@
           <w:p>
             <w:pPr>
               <w:spacing w:line="240" w:lineRule="auto" w:before="0" w:after="0"/>
-              <w:jc w:val="center"/>
+              <w:jc w:val="left"/>
             </w:pPr>
             <w:r/>
             <w:r>
@@ -13687,7 +13687,7 @@
           <w:p>
             <w:pPr>
               <w:spacing w:line="240" w:lineRule="auto" w:before="0" w:after="0"/>
-              <w:jc w:val="center"/>
+              <w:jc w:val="left"/>
             </w:pPr>
             <w:r/>
             <w:r>
@@ -13841,7 +13841,7 @@
           <w:p>
             <w:pPr>
               <w:spacing w:line="240" w:lineRule="auto" w:before="0" w:after="0"/>
-              <w:jc w:val="center"/>
+              <w:jc w:val="left"/>
             </w:pPr>
             <w:r/>
             <w:r>
@@ -13904,7 +13904,7 @@
           <w:p>
             <w:pPr>
               <w:spacing w:line="240" w:lineRule="auto" w:before="0" w:after="0"/>
-              <w:jc w:val="center"/>
+              <w:jc w:val="left"/>
             </w:pPr>
             <w:r/>
             <w:r>
@@ -13967,7 +13967,7 @@
           <w:p>
             <w:pPr>
               <w:spacing w:line="240" w:lineRule="auto" w:before="0" w:after="0"/>
-              <w:jc w:val="center"/>
+              <w:jc w:val="left"/>
             </w:pPr>
             <w:r/>
             <w:r>
@@ -14121,7 +14121,7 @@
           <w:p>
             <w:pPr>
               <w:spacing w:line="240" w:lineRule="auto" w:before="0" w:after="0"/>
-              <w:jc w:val="center"/>
+              <w:jc w:val="left"/>
             </w:pPr>
             <w:r/>
             <w:r>
@@ -14184,7 +14184,7 @@
           <w:p>
             <w:pPr>
               <w:spacing w:line="240" w:lineRule="auto" w:before="0" w:after="0"/>
-              <w:jc w:val="center"/>
+              <w:jc w:val="left"/>
             </w:pPr>
             <w:r/>
             <w:r>
@@ -14247,7 +14247,7 @@
           <w:p>
             <w:pPr>
               <w:spacing w:line="240" w:lineRule="auto" w:before="0" w:after="0"/>
-              <w:jc w:val="center"/>
+              <w:jc w:val="left"/>
             </w:pPr>
             <w:r/>
             <w:r>
@@ -14401,7 +14401,7 @@
           <w:p>
             <w:pPr>
               <w:spacing w:line="240" w:lineRule="auto" w:before="0" w:after="0"/>
-              <w:jc w:val="center"/>
+              <w:jc w:val="left"/>
             </w:pPr>
             <w:r/>
             <w:r>
@@ -14464,7 +14464,7 @@
           <w:p>
             <w:pPr>
               <w:spacing w:line="240" w:lineRule="auto" w:before="0" w:after="0"/>
-              <w:jc w:val="center"/>
+              <w:jc w:val="left"/>
             </w:pPr>
             <w:r/>
             <w:r>
@@ -14527,7 +14527,7 @@
           <w:p>
             <w:pPr>
               <w:spacing w:line="240" w:lineRule="auto" w:before="0" w:after="0"/>
-              <w:jc w:val="center"/>
+              <w:jc w:val="left"/>
             </w:pPr>
             <w:r/>
             <w:r>
@@ -14681,7 +14681,7 @@
           <w:p>
             <w:pPr>
               <w:spacing w:line="240" w:lineRule="auto" w:before="0" w:after="0"/>
-              <w:jc w:val="center"/>
+              <w:jc w:val="left"/>
             </w:pPr>
             <w:r/>
             <w:r>
@@ -14744,7 +14744,7 @@
           <w:p>
             <w:pPr>
               <w:spacing w:line="240" w:lineRule="auto" w:before="0" w:after="0"/>
-              <w:jc w:val="center"/>
+              <w:jc w:val="left"/>
             </w:pPr>
             <w:r/>
             <w:r>
@@ -14807,7 +14807,7 @@
           <w:p>
             <w:pPr>
               <w:spacing w:line="240" w:lineRule="auto" w:before="0" w:after="0"/>
-              <w:jc w:val="center"/>
+              <w:jc w:val="left"/>
             </w:pPr>
             <w:r/>
             <w:r>
@@ -14961,7 +14961,7 @@
           <w:p>
             <w:pPr>
               <w:spacing w:line="240" w:lineRule="auto" w:before="0" w:after="0"/>
-              <w:jc w:val="center"/>
+              <w:jc w:val="left"/>
             </w:pPr>
             <w:r/>
             <w:r>
@@ -15024,7 +15024,7 @@
           <w:p>
             <w:pPr>
               <w:spacing w:line="240" w:lineRule="auto" w:before="0" w:after="0"/>
-              <w:jc w:val="center"/>
+              <w:jc w:val="left"/>
             </w:pPr>
             <w:r/>
             <w:r>
@@ -15087,7 +15087,7 @@
           <w:p>
             <w:pPr>
               <w:spacing w:line="240" w:lineRule="auto" w:before="0" w:after="0"/>
-              <w:jc w:val="center"/>
+              <w:jc w:val="left"/>
             </w:pPr>
             <w:r/>
             <w:r>
@@ -15241,7 +15241,7 @@
           <w:p>
             <w:pPr>
               <w:spacing w:line="240" w:lineRule="auto" w:before="0" w:after="0"/>
-              <w:jc w:val="center"/>
+              <w:jc w:val="left"/>
             </w:pPr>
             <w:r/>
             <w:r>
@@ -15304,7 +15304,7 @@
           <w:p>
             <w:pPr>
               <w:spacing w:line="240" w:lineRule="auto" w:before="0" w:after="0"/>
-              <w:jc w:val="center"/>
+              <w:jc w:val="left"/>
             </w:pPr>
             <w:r/>
             <w:r>
@@ -15367,7 +15367,7 @@
           <w:p>
             <w:pPr>
               <w:spacing w:line="240" w:lineRule="auto" w:before="0" w:after="0"/>
-              <w:jc w:val="center"/>
+              <w:jc w:val="left"/>
             </w:pPr>
             <w:r/>
             <w:r>
@@ -15521,7 +15521,7 @@
           <w:p>
             <w:pPr>
               <w:spacing w:line="240" w:lineRule="auto" w:before="0" w:after="0"/>
-              <w:jc w:val="center"/>
+              <w:jc w:val="left"/>
             </w:pPr>
             <w:r/>
             <w:r>
@@ -15584,7 +15584,7 @@
           <w:p>
             <w:pPr>
               <w:spacing w:line="240" w:lineRule="auto" w:before="0" w:after="0"/>
-              <w:jc w:val="center"/>
+              <w:jc w:val="left"/>
             </w:pPr>
             <w:r/>
             <w:r>
@@ -15647,7 +15647,7 @@
           <w:p>
             <w:pPr>
               <w:spacing w:line="240" w:lineRule="auto" w:before="0" w:after="0"/>
-              <w:jc w:val="center"/>
+              <w:jc w:val="left"/>
             </w:pPr>
             <w:r/>
             <w:r>
@@ -15801,7 +15801,7 @@
           <w:p>
             <w:pPr>
               <w:spacing w:line="240" w:lineRule="auto" w:before="0" w:after="0"/>
-              <w:jc w:val="center"/>
+              <w:jc w:val="left"/>
             </w:pPr>
             <w:r/>
             <w:r>
@@ -15864,7 +15864,7 @@
           <w:p>
             <w:pPr>
               <w:spacing w:line="240" w:lineRule="auto" w:before="0" w:after="0"/>
-              <w:jc w:val="center"/>
+              <w:jc w:val="left"/>
             </w:pPr>
             <w:r/>
             <w:r>
@@ -15927,7 +15927,7 @@
           <w:p>
             <w:pPr>
               <w:spacing w:line="240" w:lineRule="auto" w:before="0" w:after="0"/>
-              <w:jc w:val="center"/>
+              <w:jc w:val="left"/>
             </w:pPr>
             <w:r/>
             <w:r>
@@ -16081,7 +16081,7 @@
           <w:p>
             <w:pPr>
               <w:spacing w:line="240" w:lineRule="auto" w:before="0" w:after="0"/>
-              <w:jc w:val="center"/>
+              <w:jc w:val="left"/>
             </w:pPr>
             <w:r/>
             <w:r>
@@ -16144,7 +16144,7 @@
           <w:p>
             <w:pPr>
               <w:spacing w:line="240" w:lineRule="auto" w:before="0" w:after="0"/>
-              <w:jc w:val="center"/>
+              <w:jc w:val="left"/>
             </w:pPr>
             <w:r/>
             <w:r>
@@ -16207,7 +16207,7 @@
           <w:p>
             <w:pPr>
               <w:spacing w:line="240" w:lineRule="auto" w:before="0" w:after="0"/>
-              <w:jc w:val="center"/>
+              <w:jc w:val="left"/>
             </w:pPr>
             <w:r/>
             <w:r>
@@ -16361,7 +16361,7 @@
           <w:p>
             <w:pPr>
               <w:spacing w:line="240" w:lineRule="auto" w:before="0" w:after="0"/>
-              <w:jc w:val="center"/>
+              <w:jc w:val="left"/>
             </w:pPr>
             <w:r/>
             <w:r>
@@ -16424,7 +16424,7 @@
           <w:p>
             <w:pPr>
               <w:spacing w:line="240" w:lineRule="auto" w:before="0" w:after="0"/>
-              <w:jc w:val="center"/>
+              <w:jc w:val="left"/>
             </w:pPr>
             <w:r/>
             <w:r>
@@ -16487,7 +16487,7 @@
           <w:p>
             <w:pPr>
               <w:spacing w:line="240" w:lineRule="auto" w:before="0" w:after="0"/>
-              <w:jc w:val="center"/>
+              <w:jc w:val="left"/>
             </w:pPr>
             <w:r/>
             <w:r>
@@ -16641,7 +16641,7 @@
           <w:p>
             <w:pPr>
               <w:spacing w:line="240" w:lineRule="auto" w:before="0" w:after="0"/>
-              <w:jc w:val="center"/>
+              <w:jc w:val="left"/>
             </w:pPr>
             <w:r/>
             <w:r>
@@ -16704,7 +16704,7 @@
           <w:p>
             <w:pPr>
               <w:spacing w:line="240" w:lineRule="auto" w:before="0" w:after="0"/>
-              <w:jc w:val="center"/>
+              <w:jc w:val="left"/>
             </w:pPr>
             <w:r/>
             <w:r>
@@ -16767,7 +16767,7 @@
           <w:p>
             <w:pPr>
               <w:spacing w:line="240" w:lineRule="auto" w:before="0" w:after="0"/>
-              <w:jc w:val="center"/>
+              <w:jc w:val="left"/>
             </w:pPr>
             <w:r/>
             <w:r>
@@ -16921,7 +16921,7 @@
           <w:p>
             <w:pPr>
               <w:spacing w:line="240" w:lineRule="auto" w:before="0" w:after="0"/>
-              <w:jc w:val="center"/>
+              <w:jc w:val="left"/>
             </w:pPr>
             <w:r/>
             <w:r>
@@ -16984,7 +16984,7 @@
           <w:p>
             <w:pPr>
               <w:spacing w:line="240" w:lineRule="auto" w:before="0" w:after="0"/>
-              <w:jc w:val="center"/>
+              <w:jc w:val="left"/>
             </w:pPr>
             <w:r/>
             <w:r>
@@ -17047,7 +17047,7 @@
           <w:p>
             <w:pPr>
               <w:spacing w:line="240" w:lineRule="auto" w:before="0" w:after="0"/>
-              <w:jc w:val="center"/>
+              <w:jc w:val="left"/>
             </w:pPr>
             <w:r/>
             <w:r>
@@ -17201,7 +17201,7 @@
           <w:p>
             <w:pPr>
               <w:spacing w:line="240" w:lineRule="auto" w:before="0" w:after="0"/>
-              <w:jc w:val="center"/>
+              <w:jc w:val="left"/>
             </w:pPr>
             <w:r/>
             <w:r>
@@ -17264,7 +17264,7 @@
           <w:p>
             <w:pPr>
               <w:spacing w:line="240" w:lineRule="auto" w:before="0" w:after="0"/>
-              <w:jc w:val="center"/>
+              <w:jc w:val="left"/>
             </w:pPr>
             <w:r/>
             <w:r>
@@ -17327,7 +17327,7 @@
           <w:p>
             <w:pPr>
               <w:spacing w:line="240" w:lineRule="auto" w:before="0" w:after="0"/>
-              <w:jc w:val="center"/>
+              <w:jc w:val="left"/>
             </w:pPr>
             <w:r/>
             <w:r>
@@ -17481,7 +17481,7 @@
           <w:p>
             <w:pPr>
               <w:spacing w:line="240" w:lineRule="auto" w:before="0" w:after="0"/>
-              <w:jc w:val="center"/>
+              <w:jc w:val="left"/>
             </w:pPr>
             <w:r/>
             <w:r>
@@ -17544,7 +17544,7 @@
           <w:p>
             <w:pPr>
               <w:spacing w:line="240" w:lineRule="auto" w:before="0" w:after="0"/>
-              <w:jc w:val="center"/>
+              <w:jc w:val="left"/>
             </w:pPr>
             <w:r/>
             <w:r>
@@ -17607,7 +17607,7 @@
           <w:p>
             <w:pPr>
               <w:spacing w:line="240" w:lineRule="auto" w:before="0" w:after="0"/>
-              <w:jc w:val="center"/>
+              <w:jc w:val="left"/>
             </w:pPr>
             <w:r/>
             <w:r>
@@ -17761,7 +17761,7 @@
           <w:p>
             <w:pPr>
               <w:spacing w:line="240" w:lineRule="auto" w:before="0" w:after="0"/>
-              <w:jc w:val="center"/>
+              <w:jc w:val="left"/>
             </w:pPr>
             <w:r/>
             <w:r>
@@ -17824,7 +17824,7 @@
           <w:p>
             <w:pPr>
               <w:spacing w:line="240" w:lineRule="auto" w:before="0" w:after="0"/>
-              <w:jc w:val="center"/>
+              <w:jc w:val="left"/>
             </w:pPr>
             <w:r/>
             <w:r>
@@ -17887,7 +17887,7 @@
           <w:p>
             <w:pPr>
               <w:spacing w:line="240" w:lineRule="auto" w:before="0" w:after="0"/>
-              <w:jc w:val="center"/>
+              <w:jc w:val="left"/>
             </w:pPr>
             <w:r/>
             <w:r>
@@ -18041,7 +18041,7 @@
           <w:p>
             <w:pPr>
               <w:spacing w:line="240" w:lineRule="auto" w:before="0" w:after="0"/>
-              <w:jc w:val="center"/>
+              <w:jc w:val="left"/>
             </w:pPr>
             <w:r/>
             <w:r>
@@ -18104,7 +18104,7 @@
           <w:p>
             <w:pPr>
               <w:spacing w:line="240" w:lineRule="auto" w:before="0" w:after="0"/>
-              <w:jc w:val="center"/>
+              <w:jc w:val="left"/>
             </w:pPr>
             <w:r/>
             <w:r>
@@ -18167,7 +18167,7 @@
           <w:p>
             <w:pPr>
               <w:spacing w:line="240" w:lineRule="auto" w:before="0" w:after="0"/>
-              <w:jc w:val="center"/>
+              <w:jc w:val="left"/>
             </w:pPr>
             <w:r/>
             <w:r>
@@ -18321,7 +18321,7 @@
           <w:p>
             <w:pPr>
               <w:spacing w:line="240" w:lineRule="auto" w:before="0" w:after="0"/>
-              <w:jc w:val="center"/>
+              <w:jc w:val="left"/>
             </w:pPr>
             <w:r/>
             <w:r>
@@ -18384,7 +18384,7 @@
           <w:p>
             <w:pPr>
               <w:spacing w:line="240" w:lineRule="auto" w:before="0" w:after="0"/>
-              <w:jc w:val="center"/>
+              <w:jc w:val="left"/>
             </w:pPr>
             <w:r/>
             <w:r>
@@ -18447,7 +18447,7 @@
           <w:p>
             <w:pPr>
               <w:spacing w:line="240" w:lineRule="auto" w:before="0" w:after="0"/>
-              <w:jc w:val="center"/>
+              <w:jc w:val="left"/>
             </w:pPr>
             <w:r/>
             <w:r>
@@ -18601,7 +18601,7 @@
           <w:p>
             <w:pPr>
               <w:spacing w:line="240" w:lineRule="auto" w:before="0" w:after="0"/>
-              <w:jc w:val="center"/>
+              <w:jc w:val="left"/>
             </w:pPr>
             <w:r/>
             <w:r>
@@ -18664,7 +18664,7 @@
           <w:p>
             <w:pPr>
               <w:spacing w:line="240" w:lineRule="auto" w:before="0" w:after="0"/>
-              <w:jc w:val="center"/>
+              <w:jc w:val="left"/>
             </w:pPr>
             <w:r/>
             <w:r>
@@ -18727,7 +18727,7 @@
           <w:p>
             <w:pPr>
               <w:spacing w:line="240" w:lineRule="auto" w:before="0" w:after="0"/>
-              <w:jc w:val="center"/>
+              <w:jc w:val="left"/>
             </w:pPr>
             <w:r/>
             <w:r>
@@ -18881,7 +18881,7 @@
           <w:p>
             <w:pPr>
               <w:spacing w:line="240" w:lineRule="auto" w:before="0" w:after="0"/>
-              <w:jc w:val="center"/>
+              <w:jc w:val="left"/>
             </w:pPr>
             <w:r/>
             <w:r>
@@ -18944,7 +18944,7 @@
           <w:p>
             <w:pPr>
               <w:spacing w:line="240" w:lineRule="auto" w:before="0" w:after="0"/>
-              <w:jc w:val="center"/>
+              <w:jc w:val="left"/>
             </w:pPr>
             <w:r/>
             <w:r>
@@ -19007,7 +19007,7 @@
           <w:p>
             <w:pPr>
               <w:spacing w:line="240" w:lineRule="auto" w:before="0" w:after="0"/>
-              <w:jc w:val="center"/>
+              <w:jc w:val="left"/>
             </w:pPr>
             <w:r/>
             <w:r>
@@ -19161,7 +19161,7 @@
           <w:p>
             <w:pPr>
               <w:spacing w:line="240" w:lineRule="auto" w:before="0" w:after="0"/>
-              <w:jc w:val="center"/>
+              <w:jc w:val="left"/>
             </w:pPr>
             <w:r/>
             <w:r>
@@ -19224,7 +19224,7 @@
           <w:p>
             <w:pPr>
               <w:spacing w:line="240" w:lineRule="auto" w:before="0" w:after="0"/>
-              <w:jc w:val="center"/>
+              <w:jc w:val="left"/>
             </w:pPr>
             <w:r/>
             <w:r>
@@ -19287,7 +19287,7 @@
           <w:p>
             <w:pPr>
               <w:spacing w:line="240" w:lineRule="auto" w:before="0" w:after="0"/>
-              <w:jc w:val="center"/>
+              <w:jc w:val="left"/>
             </w:pPr>
             <w:r/>
             <w:r>
@@ -19441,7 +19441,7 @@
           <w:p>
             <w:pPr>
               <w:spacing w:line="240" w:lineRule="auto" w:before="0" w:after="0"/>
-              <w:jc w:val="center"/>
+              <w:jc w:val="left"/>
             </w:pPr>
             <w:r/>
             <w:r>
@@ -19504,7 +19504,7 @@
           <w:p>
             <w:pPr>
               <w:spacing w:line="240" w:lineRule="auto" w:before="0" w:after="0"/>
-              <w:jc w:val="center"/>
+              <w:jc w:val="left"/>
             </w:pPr>
             <w:r/>
             <w:r>
@@ -19567,7 +19567,7 @@
           <w:p>
             <w:pPr>
               <w:spacing w:line="240" w:lineRule="auto" w:before="0" w:after="0"/>
-              <w:jc w:val="center"/>
+              <w:jc w:val="left"/>
             </w:pPr>
             <w:r/>
             <w:r>
@@ -19721,7 +19721,7 @@
           <w:p>
             <w:pPr>
               <w:spacing w:line="240" w:lineRule="auto" w:before="0" w:after="0"/>
-              <w:jc w:val="center"/>
+              <w:jc w:val="left"/>
             </w:pPr>
             <w:r/>
             <w:r>
@@ -19784,7 +19784,7 @@
           <w:p>
             <w:pPr>
               <w:spacing w:line="240" w:lineRule="auto" w:before="0" w:after="0"/>
-              <w:jc w:val="center"/>
+              <w:jc w:val="left"/>
             </w:pPr>
             <w:r/>
             <w:r>
@@ -19847,7 +19847,7 @@
           <w:p>
             <w:pPr>
               <w:spacing w:line="240" w:lineRule="auto" w:before="0" w:after="0"/>
-              <w:jc w:val="center"/>
+              <w:jc w:val="left"/>
             </w:pPr>
             <w:r/>
             <w:r>
@@ -20001,7 +20001,7 @@
           <w:p>
             <w:pPr>
               <w:spacing w:line="240" w:lineRule="auto" w:before="0" w:after="0"/>
-              <w:jc w:val="center"/>
+              <w:jc w:val="left"/>
             </w:pPr>
             <w:r/>
             <w:r>
@@ -20064,7 +20064,7 @@
           <w:p>
             <w:pPr>
               <w:spacing w:line="240" w:lineRule="auto" w:before="0" w:after="0"/>
-              <w:jc w:val="center"/>
+              <w:jc w:val="left"/>
             </w:pPr>
             <w:r/>
             <w:r>
@@ -20127,7 +20127,7 @@
           <w:p>
             <w:pPr>
               <w:spacing w:line="240" w:lineRule="auto" w:before="0" w:after="0"/>
-              <w:jc w:val="center"/>
+              <w:jc w:val="left"/>
             </w:pPr>
             <w:r/>
             <w:r>
@@ -20281,7 +20281,7 @@
           <w:p>
             <w:pPr>
               <w:spacing w:line="240" w:lineRule="auto" w:before="0" w:after="0"/>
-              <w:jc w:val="center"/>
+              <w:jc w:val="left"/>
             </w:pPr>
             <w:r/>
             <w:r>
@@ -20344,7 +20344,7 @@
           <w:p>
             <w:pPr>
               <w:spacing w:line="240" w:lineRule="auto" w:before="0" w:after="0"/>
-              <w:jc w:val="center"/>
+              <w:jc w:val="left"/>
             </w:pPr>
             <w:r/>
             <w:r>
@@ -20407,7 +20407,7 @@
           <w:p>
             <w:pPr>
               <w:spacing w:line="240" w:lineRule="auto" w:before="0" w:after="0"/>
-              <w:jc w:val="center"/>
+              <w:jc w:val="left"/>
             </w:pPr>
             <w:r/>
             <w:r>
@@ -20561,7 +20561,7 @@
           <w:p>
             <w:pPr>
               <w:spacing w:line="240" w:lineRule="auto" w:before="0" w:after="0"/>
-              <w:jc w:val="center"/>
+              <w:jc w:val="left"/>
             </w:pPr>
             <w:r/>
             <w:r>
@@ -20624,7 +20624,7 @@
           <w:p>
             <w:pPr>
               <w:spacing w:line="240" w:lineRule="auto" w:before="0" w:after="0"/>
-              <w:jc w:val="center"/>
+              <w:jc w:val="left"/>
             </w:pPr>
             <w:r/>
             <w:r>
@@ -20687,7 +20687,7 @@
           <w:p>
             <w:pPr>
               <w:spacing w:line="240" w:lineRule="auto" w:before="0" w:after="0"/>
-              <w:jc w:val="center"/>
+              <w:jc w:val="left"/>
             </w:pPr>
             <w:r/>
             <w:r>
@@ -20841,7 +20841,7 @@
           <w:p>
             <w:pPr>
               <w:spacing w:line="240" w:lineRule="auto" w:before="0" w:after="0"/>
-              <w:jc w:val="center"/>
+              <w:jc w:val="left"/>
             </w:pPr>
             <w:r/>
             <w:r>
@@ -20904,7 +20904,7 @@
           <w:p>
             <w:pPr>
               <w:spacing w:line="240" w:lineRule="auto" w:before="0" w:after="0"/>
-              <w:jc w:val="center"/>
+              <w:jc w:val="left"/>
             </w:pPr>
             <w:r/>
             <w:r>
@@ -20967,7 +20967,7 @@
           <w:p>
             <w:pPr>
               <w:spacing w:line="240" w:lineRule="auto" w:before="0" w:after="0"/>
-              <w:jc w:val="center"/>
+              <w:jc w:val="left"/>
             </w:pPr>
             <w:r/>
             <w:r>
@@ -21121,7 +21121,7 @@
           <w:p>
             <w:pPr>
               <w:spacing w:line="240" w:lineRule="auto" w:before="0" w:after="0"/>
-              <w:jc w:val="center"/>
+              <w:jc w:val="left"/>
             </w:pPr>
             <w:r/>
             <w:r>
@@ -21184,7 +21184,7 @@
           <w:p>
             <w:pPr>
               <w:spacing w:line="240" w:lineRule="auto" w:before="0" w:after="0"/>
-              <w:jc w:val="center"/>
+              <w:jc w:val="left"/>
             </w:pPr>
             <w:r/>
             <w:r>
@@ -21247,7 +21247,7 @@
           <w:p>
             <w:pPr>
               <w:spacing w:line="240" w:lineRule="auto" w:before="0" w:after="0"/>
-              <w:jc w:val="center"/>
+              <w:jc w:val="left"/>
             </w:pPr>
             <w:r/>
             <w:r>
@@ -21401,7 +21401,7 @@
           <w:p>
             <w:pPr>
               <w:spacing w:line="240" w:lineRule="auto" w:before="0" w:after="0"/>
-              <w:jc w:val="center"/>
+              <w:jc w:val="left"/>
             </w:pPr>
             <w:r/>
             <w:r>
@@ -21464,7 +21464,7 @@
           <w:p>
             <w:pPr>
               <w:spacing w:line="240" w:lineRule="auto" w:before="0" w:after="0"/>
-              <w:jc w:val="center"/>
+              <w:jc w:val="left"/>
             </w:pPr>
             <w:r/>
             <w:r>
@@ -21527,7 +21527,7 @@
           <w:p>
             <w:pPr>
               <w:spacing w:line="240" w:lineRule="auto" w:before="0" w:after="0"/>
-              <w:jc w:val="center"/>
+              <w:jc w:val="left"/>
             </w:pPr>
             <w:r/>
             <w:r>
@@ -21681,7 +21681,7 @@
           <w:p>
             <w:pPr>
               <w:spacing w:line="240" w:lineRule="auto" w:before="0" w:after="0"/>
-              <w:jc w:val="center"/>
+              <w:jc w:val="left"/>
             </w:pPr>
             <w:r/>
             <w:r>
@@ -21744,7 +21744,7 @@
           <w:p>
             <w:pPr>
               <w:spacing w:line="240" w:lineRule="auto" w:before="0" w:after="0"/>
-              <w:jc w:val="center"/>
+              <w:jc w:val="left"/>
             </w:pPr>
             <w:r/>
             <w:r>
@@ -21807,7 +21807,7 @@
           <w:p>
             <w:pPr>
               <w:spacing w:line="240" w:lineRule="auto" w:before="0" w:after="0"/>
-              <w:jc w:val="center"/>
+              <w:jc w:val="left"/>
             </w:pPr>
             <w:r/>
             <w:r>
@@ -21961,7 +21961,7 @@
           <w:p>
             <w:pPr>
               <w:spacing w:line="240" w:lineRule="auto" w:before="0" w:after="0"/>
-              <w:jc w:val="center"/>
+              <w:jc w:val="left"/>
             </w:pPr>
             <w:r/>
             <w:r>
@@ -22024,7 +22024,7 @@
           <w:p>
             <w:pPr>
               <w:spacing w:line="240" w:lineRule="auto" w:before="0" w:after="0"/>
-              <w:jc w:val="center"/>
+              <w:jc w:val="left"/>
             </w:pPr>
             <w:r/>
             <w:r>
@@ -22087,7 +22087,7 @@
           <w:p>
             <w:pPr>
               <w:spacing w:line="240" w:lineRule="auto" w:before="0" w:after="0"/>
-              <w:jc w:val="center"/>
+              <w:jc w:val="left"/>
             </w:pPr>
             <w:r/>
             <w:r>
@@ -22241,7 +22241,7 @@
           <w:p>
             <w:pPr>
               <w:spacing w:line="240" w:lineRule="auto" w:before="0" w:after="0"/>
-              <w:jc w:val="center"/>
+              <w:jc w:val="left"/>
             </w:pPr>
             <w:r/>
             <w:r>
@@ -22304,7 +22304,7 @@
           <w:p>
             <w:pPr>
               <w:spacing w:line="240" w:lineRule="auto" w:before="0" w:after="0"/>
-              <w:jc w:val="center"/>
+              <w:jc w:val="left"/>
             </w:pPr>
             <w:r/>
             <w:r>
@@ -22367,7 +22367,7 @@
           <w:p>
             <w:pPr>
               <w:spacing w:line="240" w:lineRule="auto" w:before="0" w:after="0"/>
-              <w:jc w:val="center"/>
+              <w:jc w:val="left"/>
             </w:pPr>
             <w:r/>
             <w:r>
@@ -22521,7 +22521,7 @@
           <w:p>
             <w:pPr>
               <w:spacing w:line="240" w:lineRule="auto" w:before="0" w:after="0"/>
-              <w:jc w:val="center"/>
+              <w:jc w:val="left"/>
             </w:pPr>
             <w:r/>
             <w:r>
@@ -22584,7 +22584,7 @@
           <w:p>
             <w:pPr>
               <w:spacing w:line="240" w:lineRule="auto" w:before="0" w:after="0"/>
-              <w:jc w:val="center"/>
+              <w:jc w:val="left"/>
             </w:pPr>
             <w:r/>
             <w:r>
@@ -22647,7 +22647,7 @@
           <w:p>
             <w:pPr>
               <w:spacing w:line="240" w:lineRule="auto" w:before="0" w:after="0"/>
-              <w:jc w:val="center"/>
+              <w:jc w:val="left"/>
             </w:pPr>
             <w:r/>
             <w:r>
@@ -22801,7 +22801,7 @@
           <w:p>
             <w:pPr>
               <w:spacing w:line="240" w:lineRule="auto" w:before="0" w:after="0"/>
-              <w:jc w:val="center"/>
+              <w:jc w:val="left"/>
             </w:pPr>
             <w:r/>
             <w:r>
@@ -22864,7 +22864,7 @@
           <w:p>
             <w:pPr>
               <w:spacing w:line="240" w:lineRule="auto" w:before="0" w:after="0"/>
-              <w:jc w:val="center"/>
+              <w:jc w:val="left"/>
             </w:pPr>
             <w:r/>
             <w:r>
@@ -22927,7 +22927,7 @@
           <w:p>
             <w:pPr>
               <w:spacing w:line="240" w:lineRule="auto" w:before="0" w:after="0"/>
-              <w:jc w:val="center"/>
+              <w:jc w:val="left"/>
             </w:pPr>
             <w:r/>
             <w:r>
@@ -23081,7 +23081,7 @@
           <w:p>
             <w:pPr>
               <w:spacing w:line="240" w:lineRule="auto" w:before="0" w:after="0"/>
-              <w:jc w:val="center"/>
+              <w:jc w:val="left"/>
             </w:pPr>
             <w:r/>
             <w:r>
@@ -23144,7 +23144,7 @@
           <w:p>
             <w:pPr>
               <w:spacing w:line="240" w:lineRule="auto" w:before="0" w:after="0"/>
-              <w:jc w:val="center"/>
+              <w:jc w:val="left"/>
             </w:pPr>
             <w:r/>
             <w:r>
@@ -23207,7 +23207,7 @@
           <w:p>
             <w:pPr>
               <w:spacing w:line="240" w:lineRule="auto" w:before="0" w:after="0"/>
-              <w:jc w:val="center"/>
+              <w:jc w:val="left"/>
             </w:pPr>
             <w:r/>
             <w:r>
@@ -23361,7 +23361,7 @@
           <w:p>
             <w:pPr>
               <w:spacing w:line="240" w:lineRule="auto" w:before="0" w:after="0"/>
-              <w:jc w:val="center"/>
+              <w:jc w:val="left"/>
             </w:pPr>
             <w:r/>
             <w:r>
@@ -23424,7 +23424,7 @@
           <w:p>
             <w:pPr>
               <w:spacing w:line="240" w:lineRule="auto" w:before="0" w:after="0"/>
-              <w:jc w:val="center"/>
+              <w:jc w:val="left"/>
             </w:pPr>
             <w:r/>
             <w:r>
@@ -23487,7 +23487,7 @@
           <w:p>
             <w:pPr>
               <w:spacing w:line="240" w:lineRule="auto" w:before="0" w:after="0"/>
-              <w:jc w:val="center"/>
+              <w:jc w:val="left"/>
             </w:pPr>
             <w:r/>
             <w:r>

</xml_diff>

<commit_message>
Reorder options so the correct answer is always first in both quizzes
Co-authored-by: arena-agent <297053741+arena-agent@users.noreply.github.com>
</commit_message>
<xml_diff>
--- a/quiz.docx
+++ b/quiz.docx
@@ -410,7 +410,7 @@
                 <w:b w:val="0"/>
                 <w:sz w:val="24"/>
               </w:rPr>
-              <w:t>space exploration</w:t>
+              <w:t>consumer protection</w:t>
             </w:r>
           </w:p>
         </w:tc>
@@ -430,7 +430,7 @@
                 <w:b w:val="0"/>
                 <w:sz w:val="24"/>
               </w:rPr>
-              <w:t>-</w:t>
+              <w:t>+</w:t>
             </w:r>
           </w:p>
         </w:tc>
@@ -473,7 +473,7 @@
                 <w:b w:val="0"/>
                 <w:sz w:val="24"/>
               </w:rPr>
-              <w:t>consumer protection</w:t>
+              <w:t>space exploration</w:t>
             </w:r>
           </w:p>
         </w:tc>
@@ -493,7 +493,7 @@
                 <w:b w:val="0"/>
                 <w:sz w:val="24"/>
               </w:rPr>
-              <w:t>+</w:t>
+              <w:t>-</w:t>
             </w:r>
           </w:p>
         </w:tc>
@@ -690,7 +690,7 @@
                 <w:b w:val="0"/>
                 <w:sz w:val="24"/>
               </w:rPr>
-              <w:t>wearing gloves only</w:t>
+              <w:t>hand hygiene</w:t>
             </w:r>
           </w:p>
         </w:tc>
@@ -710,7 +710,7 @@
                 <w:b w:val="0"/>
                 <w:sz w:val="24"/>
               </w:rPr>
-              <w:t>-</w:t>
+              <w:t>+</w:t>
             </w:r>
           </w:p>
         </w:tc>
@@ -753,7 +753,7 @@
                 <w:b w:val="0"/>
                 <w:sz w:val="24"/>
               </w:rPr>
-              <w:t>hand hygiene</w:t>
+              <w:t>wearing gloves only</w:t>
             </w:r>
           </w:p>
         </w:tc>
@@ -773,7 +773,7 @@
                 <w:b w:val="0"/>
                 <w:sz w:val="24"/>
               </w:rPr>
-              <w:t>+</w:t>
+              <w:t>-</w:t>
             </w:r>
           </w:p>
         </w:tc>
@@ -970,7 +970,7 @@
                 <w:b w:val="0"/>
                 <w:sz w:val="24"/>
               </w:rPr>
-              <w:t>allergies</w:t>
+              <w:t>opportunistic infections</w:t>
             </w:r>
           </w:p>
         </w:tc>
@@ -990,7 +990,7 @@
                 <w:b w:val="0"/>
                 <w:sz w:val="24"/>
               </w:rPr>
-              <w:t>-</w:t>
+              <w:t>+</w:t>
             </w:r>
           </w:p>
         </w:tc>
@@ -1033,7 +1033,7 @@
                 <w:b w:val="0"/>
                 <w:sz w:val="24"/>
               </w:rPr>
-              <w:t>genetic disorders</w:t>
+              <w:t>allergies</w:t>
             </w:r>
           </w:p>
         </w:tc>
@@ -1096,7 +1096,7 @@
                 <w:b w:val="0"/>
                 <w:sz w:val="24"/>
               </w:rPr>
-              <w:t>opportunistic infections</w:t>
+              <w:t>genetic disorders</w:t>
             </w:r>
           </w:p>
         </w:tc>
@@ -1116,7 +1116,7 @@
                 <w:b w:val="0"/>
                 <w:sz w:val="24"/>
               </w:rPr>
-              <w:t>+</w:t>
+              <w:t>-</w:t>
             </w:r>
           </w:p>
         </w:tc>
@@ -1250,7 +1250,7 @@
                 <w:b w:val="0"/>
                 <w:sz w:val="24"/>
               </w:rPr>
-              <w:t>take</w:t>
+              <w:t>is taking</w:t>
             </w:r>
           </w:p>
         </w:tc>
@@ -1270,7 +1270,7 @@
                 <w:b w:val="0"/>
                 <w:sz w:val="24"/>
               </w:rPr>
-              <w:t>-</w:t>
+              <w:t>+</w:t>
             </w:r>
           </w:p>
         </w:tc>
@@ -1313,7 +1313,7 @@
                 <w:b w:val="0"/>
                 <w:sz w:val="24"/>
               </w:rPr>
-              <w:t>takes</w:t>
+              <w:t>take</w:t>
             </w:r>
           </w:p>
         </w:tc>
@@ -1376,7 +1376,7 @@
                 <w:b w:val="0"/>
                 <w:sz w:val="24"/>
               </w:rPr>
-              <w:t>is taking</w:t>
+              <w:t>takes</w:t>
             </w:r>
           </w:p>
         </w:tc>
@@ -1396,7 +1396,7 @@
                 <w:b w:val="0"/>
                 <w:sz w:val="24"/>
               </w:rPr>
-              <w:t>+</w:t>
+              <w:t>-</w:t>
             </w:r>
           </w:p>
         </w:tc>
@@ -1530,7 +1530,7 @@
                 <w:b w:val="0"/>
                 <w:sz w:val="24"/>
               </w:rPr>
-              <w:t>MRI</w:t>
+              <w:t>ECG</w:t>
             </w:r>
           </w:p>
         </w:tc>
@@ -1550,7 +1550,7 @@
                 <w:b w:val="0"/>
                 <w:sz w:val="24"/>
               </w:rPr>
-              <w:t>-</w:t>
+              <w:t>+</w:t>
             </w:r>
           </w:p>
         </w:tc>
@@ -1593,7 +1593,7 @@
                 <w:b w:val="0"/>
                 <w:sz w:val="24"/>
               </w:rPr>
-              <w:t>ECG</w:t>
+              <w:t>MRI</w:t>
             </w:r>
           </w:p>
         </w:tc>
@@ -1613,7 +1613,7 @@
                 <w:b w:val="0"/>
                 <w:sz w:val="24"/>
               </w:rPr>
-              <w:t>+</w:t>
+              <w:t>-</w:t>
             </w:r>
           </w:p>
         </w:tc>
@@ -1810,7 +1810,7 @@
                 <w:b w:val="0"/>
                 <w:sz w:val="24"/>
               </w:rPr>
-              <w:t>treatment</w:t>
+              <w:t>hygiene</w:t>
             </w:r>
           </w:p>
         </w:tc>
@@ -1830,7 +1830,7 @@
                 <w:b w:val="0"/>
                 <w:sz w:val="24"/>
               </w:rPr>
-              <w:t>-</w:t>
+              <w:t>+</w:t>
             </w:r>
           </w:p>
         </w:tc>
@@ -1873,7 +1873,7 @@
                 <w:b w:val="0"/>
                 <w:sz w:val="24"/>
               </w:rPr>
-              <w:t>surgery</w:t>
+              <w:t>treatment</w:t>
             </w:r>
           </w:p>
         </w:tc>
@@ -1936,7 +1936,7 @@
                 <w:b w:val="0"/>
                 <w:sz w:val="24"/>
               </w:rPr>
-              <w:t>hygiene</w:t>
+              <w:t>surgery</w:t>
             </w:r>
           </w:p>
         </w:tc>
@@ -1956,7 +1956,7 @@
                 <w:b w:val="0"/>
                 <w:sz w:val="24"/>
               </w:rPr>
-              <w:t>+</w:t>
+              <w:t>-</w:t>
             </w:r>
           </w:p>
         </w:tc>
@@ -2090,7 +2090,7 @@
                 <w:b w:val="0"/>
                 <w:sz w:val="24"/>
               </w:rPr>
-              <w:t>tablet</w:t>
+              <w:t>suppository</w:t>
             </w:r>
           </w:p>
         </w:tc>
@@ -2110,7 +2110,7 @@
                 <w:b w:val="0"/>
                 <w:sz w:val="24"/>
               </w:rPr>
-              <w:t>-</w:t>
+              <w:t>+</w:t>
             </w:r>
           </w:p>
         </w:tc>
@@ -2153,7 +2153,7 @@
                 <w:b w:val="0"/>
                 <w:sz w:val="24"/>
               </w:rPr>
-              <w:t>capsule</w:t>
+              <w:t>tablet</w:t>
             </w:r>
           </w:p>
         </w:tc>
@@ -2216,7 +2216,7 @@
                 <w:b w:val="0"/>
                 <w:sz w:val="24"/>
               </w:rPr>
-              <w:t>suppository</w:t>
+              <w:t>capsule</w:t>
             </w:r>
           </w:p>
         </w:tc>
@@ -2236,7 +2236,7 @@
                 <w:b w:val="0"/>
                 <w:sz w:val="24"/>
               </w:rPr>
-              <w:t>+</w:t>
+              <w:t>-</w:t>
             </w:r>
           </w:p>
         </w:tc>
@@ -2650,7 +2650,7 @@
                 <w:b w:val="0"/>
                 <w:sz w:val="24"/>
               </w:rPr>
-              <w:t>chemicals</w:t>
+              <w:t>bacteria</w:t>
             </w:r>
           </w:p>
         </w:tc>
@@ -2670,7 +2670,7 @@
                 <w:b w:val="0"/>
                 <w:sz w:val="24"/>
               </w:rPr>
-              <w:t>-</w:t>
+              <w:t>+</w:t>
             </w:r>
           </w:p>
         </w:tc>
@@ -2713,7 +2713,7 @@
                 <w:b w:val="0"/>
                 <w:sz w:val="24"/>
               </w:rPr>
-              <w:t>bacteria</w:t>
+              <w:t>chemicals</w:t>
             </w:r>
           </w:p>
         </w:tc>
@@ -2733,7 +2733,7 @@
                 <w:b w:val="0"/>
                 <w:sz w:val="24"/>
               </w:rPr>
-              <w:t>+</w:t>
+              <w:t>-</w:t>
             </w:r>
           </w:p>
         </w:tc>
@@ -3210,7 +3210,7 @@
                 <w:b w:val="0"/>
                 <w:sz w:val="24"/>
               </w:rPr>
-              <w:t>increase prices</w:t>
+              <w:t>protect buyers from unfair practices</w:t>
             </w:r>
           </w:p>
         </w:tc>
@@ -3230,7 +3230,7 @@
                 <w:b w:val="0"/>
                 <w:sz w:val="24"/>
               </w:rPr>
-              <w:t>-</w:t>
+              <w:t>+</w:t>
             </w:r>
           </w:p>
         </w:tc>
@@ -3273,7 +3273,7 @@
                 <w:b w:val="0"/>
                 <w:sz w:val="24"/>
               </w:rPr>
-              <w:t>protect buyers from unfair practices</w:t>
+              <w:t>increase prices</w:t>
             </w:r>
           </w:p>
         </w:tc>
@@ -3293,7 +3293,7 @@
                 <w:b w:val="0"/>
                 <w:sz w:val="24"/>
               </w:rPr>
-              <w:t>+</w:t>
+              <w:t>-</w:t>
             </w:r>
           </w:p>
         </w:tc>
@@ -3490,7 +3490,7 @@
                 <w:b w:val="0"/>
                 <w:sz w:val="24"/>
               </w:rPr>
-              <w:t>Radiation</w:t>
+              <w:t>Hygiene</w:t>
             </w:r>
           </w:p>
         </w:tc>
@@ -3510,7 +3510,7 @@
                 <w:b w:val="0"/>
                 <w:sz w:val="24"/>
               </w:rPr>
-              <w:t>-</w:t>
+              <w:t>+</w:t>
             </w:r>
           </w:p>
         </w:tc>
@@ -3553,7 +3553,7 @@
                 <w:b w:val="0"/>
                 <w:sz w:val="24"/>
               </w:rPr>
-              <w:t>Medication</w:t>
+              <w:t>Radiation</w:t>
             </w:r>
           </w:p>
         </w:tc>
@@ -3616,7 +3616,7 @@
                 <w:b w:val="0"/>
                 <w:sz w:val="24"/>
               </w:rPr>
-              <w:t>Hygiene</w:t>
+              <w:t>Medication</w:t>
             </w:r>
           </w:p>
         </w:tc>
@@ -3636,7 +3636,7 @@
                 <w:b w:val="0"/>
                 <w:sz w:val="24"/>
               </w:rPr>
-              <w:t>+</w:t>
+              <w:t>-</w:t>
             </w:r>
           </w:p>
         </w:tc>
@@ -3770,7 +3770,7 @@
                 <w:b w:val="0"/>
                 <w:sz w:val="24"/>
               </w:rPr>
-              <w:t>tablet</w:t>
+              <w:t>syrup</w:t>
             </w:r>
           </w:p>
         </w:tc>
@@ -3790,7 +3790,7 @@
                 <w:b w:val="0"/>
                 <w:sz w:val="24"/>
               </w:rPr>
-              <w:t>-</w:t>
+              <w:t>+</w:t>
             </w:r>
           </w:p>
         </w:tc>
@@ -3833,7 +3833,7 @@
                 <w:b w:val="0"/>
                 <w:sz w:val="24"/>
               </w:rPr>
-              <w:t>capsule</w:t>
+              <w:t>tablet</w:t>
             </w:r>
           </w:p>
         </w:tc>
@@ -3896,7 +3896,7 @@
                 <w:b w:val="0"/>
                 <w:sz w:val="24"/>
               </w:rPr>
-              <w:t>syrup</w:t>
+              <w:t>capsule</w:t>
             </w:r>
           </w:p>
         </w:tc>
@@ -3916,7 +3916,7 @@
                 <w:b w:val="0"/>
                 <w:sz w:val="24"/>
               </w:rPr>
-              <w:t>+</w:t>
+              <w:t>-</w:t>
             </w:r>
           </w:p>
         </w:tc>
@@ -4330,7 +4330,7 @@
                 <w:b w:val="0"/>
                 <w:sz w:val="24"/>
               </w:rPr>
-              <w:t>Cleaning</w:t>
+              <w:t>Sterilization</w:t>
             </w:r>
           </w:p>
         </w:tc>
@@ -4350,7 +4350,7 @@
                 <w:b w:val="0"/>
                 <w:sz w:val="24"/>
               </w:rPr>
-              <w:t>-</w:t>
+              <w:t>+</w:t>
             </w:r>
           </w:p>
         </w:tc>
@@ -4393,7 +4393,7 @@
                 <w:b w:val="0"/>
                 <w:sz w:val="24"/>
               </w:rPr>
-              <w:t>Sterilization</w:t>
+              <w:t>Cleaning</w:t>
             </w:r>
           </w:p>
         </w:tc>
@@ -4413,7 +4413,7 @@
                 <w:b w:val="0"/>
                 <w:sz w:val="24"/>
               </w:rPr>
-              <w:t>+</w:t>
+              <w:t>-</w:t>
             </w:r>
           </w:p>
         </w:tc>
@@ -4610,7 +4610,7 @@
                 <w:b w:val="0"/>
                 <w:sz w:val="24"/>
               </w:rPr>
-              <w:t>increasing workload</w:t>
+              <w:t>promoting work-life balance</w:t>
             </w:r>
           </w:p>
         </w:tc>
@@ -4630,7 +4630,7 @@
                 <w:b w:val="0"/>
                 <w:sz w:val="24"/>
               </w:rPr>
-              <w:t>-</w:t>
+              <w:t>+</w:t>
             </w:r>
           </w:p>
         </w:tc>
@@ -4673,7 +4673,7 @@
                 <w:b w:val="0"/>
                 <w:sz w:val="24"/>
               </w:rPr>
-              <w:t>promoting work-life balance</w:t>
+              <w:t>increasing workload</w:t>
             </w:r>
           </w:p>
         </w:tc>
@@ -4693,7 +4693,7 @@
                 <w:b w:val="0"/>
                 <w:sz w:val="24"/>
               </w:rPr>
-              <w:t>+</w:t>
+              <w:t>-</w:t>
             </w:r>
           </w:p>
         </w:tc>
@@ -4890,7 +4890,7 @@
                 <w:b w:val="0"/>
                 <w:sz w:val="24"/>
               </w:rPr>
-              <w:t>Colonoscopy</w:t>
+              <w:t>Gastroscopy</w:t>
             </w:r>
           </w:p>
         </w:tc>
@@ -4910,7 +4910,7 @@
                 <w:b w:val="0"/>
                 <w:sz w:val="24"/>
               </w:rPr>
-              <w:t>-</w:t>
+              <w:t>+</w:t>
             </w:r>
           </w:p>
         </w:tc>
@@ -4953,7 +4953,7 @@
                 <w:b w:val="0"/>
                 <w:sz w:val="24"/>
               </w:rPr>
-              <w:t>MRI</w:t>
+              <w:t>Colonoscopy</w:t>
             </w:r>
           </w:p>
         </w:tc>
@@ -5016,7 +5016,7 @@
                 <w:b w:val="0"/>
                 <w:sz w:val="24"/>
               </w:rPr>
-              <w:t>Gastroscopy</w:t>
+              <w:t>MRI</w:t>
             </w:r>
           </w:p>
         </w:tc>
@@ -5036,7 +5036,7 @@
                 <w:b w:val="0"/>
                 <w:sz w:val="24"/>
               </w:rPr>
-              <w:t>+</w:t>
+              <w:t>-</w:t>
             </w:r>
           </w:p>
         </w:tc>
@@ -5170,7 +5170,7 @@
                 <w:b w:val="0"/>
                 <w:sz w:val="24"/>
               </w:rPr>
-              <w:t>tablet</w:t>
+              <w:t>ointment</w:t>
             </w:r>
           </w:p>
         </w:tc>
@@ -5190,7 +5190,7 @@
                 <w:b w:val="0"/>
                 <w:sz w:val="24"/>
               </w:rPr>
-              <w:t>-</w:t>
+              <w:t>+</w:t>
             </w:r>
           </w:p>
         </w:tc>
@@ -5233,7 +5233,7 @@
                 <w:b w:val="0"/>
                 <w:sz w:val="24"/>
               </w:rPr>
-              <w:t>injection</w:t>
+              <w:t>tablet</w:t>
             </w:r>
           </w:p>
         </w:tc>
@@ -5296,7 +5296,7 @@
                 <w:b w:val="0"/>
                 <w:sz w:val="24"/>
               </w:rPr>
-              <w:t>ointment</w:t>
+              <w:t>injection</w:t>
             </w:r>
           </w:p>
         </w:tc>
@@ -5316,7 +5316,7 @@
                 <w:b w:val="0"/>
                 <w:sz w:val="24"/>
               </w:rPr>
-              <w:t>+</w:t>
+              <w:t>-</w:t>
             </w:r>
           </w:p>
         </w:tc>
@@ -5450,7 +5450,7 @@
                 <w:b w:val="0"/>
                 <w:sz w:val="24"/>
               </w:rPr>
-              <w:t>parks</w:t>
+              <w:t>industrial waste</w:t>
             </w:r>
           </w:p>
         </w:tc>
@@ -5470,7 +5470,7 @@
                 <w:b w:val="0"/>
                 <w:sz w:val="24"/>
               </w:rPr>
-              <w:t>-</w:t>
+              <w:t>+</w:t>
             </w:r>
           </w:p>
         </w:tc>
@@ -5513,7 +5513,7 @@
                 <w:b w:val="0"/>
                 <w:sz w:val="24"/>
               </w:rPr>
-              <w:t>industrial waste</w:t>
+              <w:t>parks</w:t>
             </w:r>
           </w:p>
         </w:tc>
@@ -5533,7 +5533,7 @@
                 <w:b w:val="0"/>
                 <w:sz w:val="24"/>
               </w:rPr>
-              <w:t>+</w:t>
+              <w:t>-</w:t>
             </w:r>
           </w:p>
         </w:tc>
@@ -5730,7 +5730,7 @@
                 <w:b w:val="0"/>
                 <w:sz w:val="24"/>
               </w:rPr>
-              <w:t>MRI</w:t>
+              <w:t>CT</w:t>
             </w:r>
           </w:p>
         </w:tc>
@@ -5750,7 +5750,7 @@
                 <w:b w:val="0"/>
                 <w:sz w:val="24"/>
               </w:rPr>
-              <w:t>-</w:t>
+              <w:t>+</w:t>
             </w:r>
           </w:p>
         </w:tc>
@@ -5793,7 +5793,7 @@
                 <w:b w:val="0"/>
                 <w:sz w:val="24"/>
               </w:rPr>
-              <w:t>CT</w:t>
+              <w:t>MRI</w:t>
             </w:r>
           </w:p>
         </w:tc>
@@ -5813,7 +5813,7 @@
                 <w:b w:val="0"/>
                 <w:sz w:val="24"/>
               </w:rPr>
-              <w:t>+</w:t>
+              <w:t>-</w:t>
             </w:r>
           </w:p>
         </w:tc>
@@ -6010,7 +6010,7 @@
                 <w:b w:val="0"/>
                 <w:sz w:val="24"/>
               </w:rPr>
-              <w:t>improved health</w:t>
+              <w:t>infectious diseases</w:t>
             </w:r>
           </w:p>
         </w:tc>
@@ -6030,7 +6030,7 @@
                 <w:b w:val="0"/>
                 <w:sz w:val="24"/>
               </w:rPr>
-              <w:t>-</w:t>
+              <w:t>+</w:t>
             </w:r>
           </w:p>
         </w:tc>
@@ -6073,7 +6073,7 @@
                 <w:b w:val="0"/>
                 <w:sz w:val="24"/>
               </w:rPr>
-              <w:t>better skin</w:t>
+              <w:t>improved health</w:t>
             </w:r>
           </w:p>
         </w:tc>
@@ -6136,7 +6136,7 @@
                 <w:b w:val="0"/>
                 <w:sz w:val="24"/>
               </w:rPr>
-              <w:t>infectious diseases</w:t>
+              <w:t>better skin</w:t>
             </w:r>
           </w:p>
         </w:tc>
@@ -6156,7 +6156,7 @@
                 <w:b w:val="0"/>
                 <w:sz w:val="24"/>
               </w:rPr>
-              <w:t>+</w:t>
+              <w:t>-</w:t>
             </w:r>
           </w:p>
         </w:tc>
@@ -6290,7 +6290,7 @@
                 <w:b w:val="0"/>
                 <w:sz w:val="24"/>
               </w:rPr>
-              <w:t>building roads</w:t>
+              <w:t>consumer rights protection</w:t>
             </w:r>
           </w:p>
         </w:tc>
@@ -6310,7 +6310,7 @@
                 <w:b w:val="0"/>
                 <w:sz w:val="24"/>
               </w:rPr>
-              <w:t>-</w:t>
+              <w:t>+</w:t>
             </w:r>
           </w:p>
         </w:tc>
@@ -6353,7 +6353,7 @@
                 <w:b w:val="0"/>
                 <w:sz w:val="24"/>
               </w:rPr>
-              <w:t>consumer rights protection</w:t>
+              <w:t>building roads</w:t>
             </w:r>
           </w:p>
         </w:tc>
@@ -6373,7 +6373,7 @@
                 <w:b w:val="0"/>
                 <w:sz w:val="24"/>
               </w:rPr>
-              <w:t>+</w:t>
+              <w:t>-</w:t>
             </w:r>
           </w:p>
         </w:tc>
@@ -6570,7 +6570,7 @@
                 <w:b w:val="0"/>
                 <w:sz w:val="24"/>
               </w:rPr>
-              <w:t>Tablet</w:t>
+              <w:t>Inhaler</w:t>
             </w:r>
           </w:p>
         </w:tc>
@@ -6590,7 +6590,7 @@
                 <w:b w:val="0"/>
                 <w:sz w:val="24"/>
               </w:rPr>
-              <w:t>-</w:t>
+              <w:t>+</w:t>
             </w:r>
           </w:p>
         </w:tc>
@@ -6633,7 +6633,7 @@
                 <w:b w:val="0"/>
                 <w:sz w:val="24"/>
               </w:rPr>
-              <w:t>Injection</w:t>
+              <w:t>Tablet</w:t>
             </w:r>
           </w:p>
         </w:tc>
@@ -6696,7 +6696,7 @@
                 <w:b w:val="0"/>
                 <w:sz w:val="24"/>
               </w:rPr>
-              <w:t>Inhaler</w:t>
+              <w:t>Injection</w:t>
             </w:r>
           </w:p>
         </w:tc>
@@ -6716,7 +6716,7 @@
                 <w:b w:val="0"/>
                 <w:sz w:val="24"/>
               </w:rPr>
-              <w:t>+</w:t>
+              <w:t>-</w:t>
             </w:r>
           </w:p>
         </w:tc>
@@ -6850,7 +6850,7 @@
                 <w:b w:val="0"/>
                 <w:sz w:val="24"/>
               </w:rPr>
-              <w:t>sound and light</w:t>
+              <w:t>ionizing and non-ionizing</w:t>
             </w:r>
           </w:p>
         </w:tc>
@@ -6870,7 +6870,7 @@
                 <w:b w:val="0"/>
                 <w:sz w:val="24"/>
               </w:rPr>
-              <w:t>-</w:t>
+              <w:t>+</w:t>
             </w:r>
           </w:p>
         </w:tc>
@@ -6913,7 +6913,7 @@
                 <w:b w:val="0"/>
                 <w:sz w:val="24"/>
               </w:rPr>
-              <w:t>ionizing and non-ionizing</w:t>
+              <w:t>sound and light</w:t>
             </w:r>
           </w:p>
         </w:tc>
@@ -6933,7 +6933,7 @@
                 <w:b w:val="0"/>
                 <w:sz w:val="24"/>
               </w:rPr>
-              <w:t>+</w:t>
+              <w:t>-</w:t>
             </w:r>
           </w:p>
         </w:tc>
@@ -7130,7 +7130,7 @@
                 <w:b w:val="0"/>
                 <w:sz w:val="24"/>
               </w:rPr>
-              <w:t>Increasing traffic</w:t>
+              <w:t>Using public transport</w:t>
             </w:r>
           </w:p>
         </w:tc>
@@ -7150,7 +7150,7 @@
                 <w:b w:val="0"/>
                 <w:sz w:val="24"/>
               </w:rPr>
-              <w:t>-</w:t>
+              <w:t>+</w:t>
             </w:r>
           </w:p>
         </w:tc>
@@ -7193,7 +7193,7 @@
                 <w:b w:val="0"/>
                 <w:sz w:val="24"/>
               </w:rPr>
-              <w:t>Using public transport</w:t>
+              <w:t>Increasing traffic</w:t>
             </w:r>
           </w:p>
         </w:tc>
@@ -7213,7 +7213,7 @@
                 <w:b w:val="0"/>
                 <w:sz w:val="24"/>
               </w:rPr>
-              <w:t>+</w:t>
+              <w:t>-</w:t>
             </w:r>
           </w:p>
         </w:tc>
@@ -7410,7 +7410,7 @@
                 <w:b w:val="0"/>
                 <w:sz w:val="24"/>
               </w:rPr>
-              <w:t>Apron</w:t>
+              <w:t>Respirator</w:t>
             </w:r>
           </w:p>
         </w:tc>
@@ -7430,7 +7430,7 @@
                 <w:b w:val="0"/>
                 <w:sz w:val="24"/>
               </w:rPr>
-              <w:t>-</w:t>
+              <w:t>+</w:t>
             </w:r>
           </w:p>
         </w:tc>
@@ -7473,7 +7473,7 @@
                 <w:b w:val="0"/>
                 <w:sz w:val="24"/>
               </w:rPr>
-              <w:t>Respirator</w:t>
+              <w:t>Apron</w:t>
             </w:r>
           </w:p>
         </w:tc>
@@ -7493,7 +7493,7 @@
                 <w:b w:val="0"/>
                 <w:sz w:val="24"/>
               </w:rPr>
-              <w:t>+</w:t>
+              <w:t>-</w:t>
             </w:r>
           </w:p>
         </w:tc>
@@ -7690,7 +7690,7 @@
                 <w:b w:val="0"/>
                 <w:sz w:val="24"/>
               </w:rPr>
-              <w:t>education</w:t>
+              <w:t>environment</w:t>
             </w:r>
           </w:p>
         </w:tc>
@@ -7710,7 +7710,7 @@
                 <w:b w:val="0"/>
                 <w:sz w:val="24"/>
               </w:rPr>
-              <w:t>-</w:t>
+              <w:t>+</w:t>
             </w:r>
           </w:p>
         </w:tc>
@@ -7753,7 +7753,7 @@
                 <w:b w:val="0"/>
                 <w:sz w:val="24"/>
               </w:rPr>
-              <w:t>environment</w:t>
+              <w:t>education</w:t>
             </w:r>
           </w:p>
         </w:tc>
@@ -7773,7 +7773,7 @@
                 <w:b w:val="0"/>
                 <w:sz w:val="24"/>
               </w:rPr>
-              <w:t>+</w:t>
+              <w:t>-</w:t>
             </w:r>
           </w:p>
         </w:tc>
@@ -7970,7 +7970,7 @@
                 <w:b w:val="0"/>
                 <w:sz w:val="24"/>
               </w:rPr>
-              <w:t>diabetes</w:t>
+              <w:t>influenza</w:t>
             </w:r>
           </w:p>
         </w:tc>
@@ -7990,7 +7990,7 @@
                 <w:b w:val="0"/>
                 <w:sz w:val="24"/>
               </w:rPr>
-              <w:t>-</w:t>
+              <w:t>+</w:t>
             </w:r>
           </w:p>
         </w:tc>
@@ -8033,7 +8033,7 @@
                 <w:b w:val="0"/>
                 <w:sz w:val="24"/>
               </w:rPr>
-              <w:t>influenza</w:t>
+              <w:t>diabetes</w:t>
             </w:r>
           </w:p>
         </w:tc>
@@ -8053,7 +8053,7 @@
                 <w:b w:val="0"/>
                 <w:sz w:val="24"/>
               </w:rPr>
-              <w:t>+</w:t>
+              <w:t>-</w:t>
             </w:r>
           </w:p>
         </w:tc>
@@ -8250,7 +8250,7 @@
                 <w:b w:val="0"/>
                 <w:sz w:val="24"/>
               </w:rPr>
-              <w:t>Tablet</w:t>
+              <w:t>Injection</w:t>
             </w:r>
           </w:p>
         </w:tc>
@@ -8270,7 +8270,7 @@
                 <w:b w:val="0"/>
                 <w:sz w:val="24"/>
               </w:rPr>
-              <w:t>-</w:t>
+              <w:t>+</w:t>
             </w:r>
           </w:p>
         </w:tc>
@@ -8313,7 +8313,7 @@
                 <w:b w:val="0"/>
                 <w:sz w:val="24"/>
               </w:rPr>
-              <w:t>Injection</w:t>
+              <w:t>Tablet</w:t>
             </w:r>
           </w:p>
         </w:tc>
@@ -8333,7 +8333,7 @@
                 <w:b w:val="0"/>
                 <w:sz w:val="24"/>
               </w:rPr>
-              <w:t>+</w:t>
+              <w:t>-</w:t>
             </w:r>
           </w:p>
         </w:tc>
@@ -8530,7 +8530,7 @@
                 <w:b w:val="0"/>
                 <w:sz w:val="24"/>
               </w:rPr>
-              <w:t>increase pollution</w:t>
+              <w:t>improve the quality of life</w:t>
             </w:r>
           </w:p>
         </w:tc>
@@ -8550,7 +8550,7 @@
                 <w:b w:val="0"/>
                 <w:sz w:val="24"/>
               </w:rPr>
-              <w:t>-</w:t>
+              <w:t>+</w:t>
             </w:r>
           </w:p>
         </w:tc>
@@ -8593,7 +8593,7 @@
                 <w:b w:val="0"/>
                 <w:sz w:val="24"/>
               </w:rPr>
-              <w:t>improve the quality of life</w:t>
+              <w:t>increase pollution</w:t>
             </w:r>
           </w:p>
         </w:tc>
@@ -8613,7 +8613,7 @@
                 <w:b w:val="0"/>
                 <w:sz w:val="24"/>
               </w:rPr>
-              <w:t>+</w:t>
+              <w:t>-</w:t>
             </w:r>
           </w:p>
         </w:tc>
@@ -8810,7 +8810,7 @@
                 <w:b w:val="0"/>
                 <w:sz w:val="24"/>
               </w:rPr>
-              <w:t>Noise</w:t>
+              <w:t>Bacteria</w:t>
             </w:r>
           </w:p>
         </w:tc>
@@ -8830,7 +8830,7 @@
                 <w:b w:val="0"/>
                 <w:sz w:val="24"/>
               </w:rPr>
-              <w:t>-</w:t>
+              <w:t>+</w:t>
             </w:r>
           </w:p>
         </w:tc>
@@ -8873,7 +8873,7 @@
                 <w:b w:val="0"/>
                 <w:sz w:val="24"/>
               </w:rPr>
-              <w:t>Radiation</w:t>
+              <w:t>Noise</w:t>
             </w:r>
           </w:p>
         </w:tc>
@@ -8936,7 +8936,7 @@
                 <w:b w:val="0"/>
                 <w:sz w:val="24"/>
               </w:rPr>
-              <w:t>Bacteria</w:t>
+              <w:t>Radiation</w:t>
             </w:r>
           </w:p>
         </w:tc>
@@ -8956,7 +8956,7 @@
                 <w:b w:val="0"/>
                 <w:sz w:val="24"/>
               </w:rPr>
-              <w:t>+</w:t>
+              <w:t>-</w:t>
             </w:r>
           </w:p>
         </w:tc>
@@ -9090,7 +9090,7 @@
                 <w:b w:val="0"/>
                 <w:sz w:val="24"/>
               </w:rPr>
-              <w:t>make food tastier</w:t>
+              <w:t>prevent foodborne diseases</w:t>
             </w:r>
           </w:p>
         </w:tc>
@@ -9110,7 +9110,7 @@
                 <w:b w:val="0"/>
                 <w:sz w:val="24"/>
               </w:rPr>
-              <w:t>-</w:t>
+              <w:t>+</w:t>
             </w:r>
           </w:p>
         </w:tc>
@@ -9153,7 +9153,7 @@
                 <w:b w:val="0"/>
                 <w:sz w:val="24"/>
               </w:rPr>
-              <w:t>prevent foodborne diseases</w:t>
+              <w:t>make food tastier</w:t>
             </w:r>
           </w:p>
         </w:tc>
@@ -9173,7 +9173,7 @@
                 <w:b w:val="0"/>
                 <w:sz w:val="24"/>
               </w:rPr>
-              <w:t>+</w:t>
+              <w:t>-</w:t>
             </w:r>
           </w:p>
         </w:tc>
@@ -9370,7 +9370,7 @@
                 <w:b w:val="0"/>
                 <w:sz w:val="24"/>
               </w:rPr>
-              <w:t>Sharing food</w:t>
+              <w:t>Regular handwashing</w:t>
             </w:r>
           </w:p>
         </w:tc>
@@ -9390,7 +9390,7 @@
                 <w:b w:val="0"/>
                 <w:sz w:val="24"/>
               </w:rPr>
-              <w:t>-</w:t>
+              <w:t>+</w:t>
             </w:r>
           </w:p>
         </w:tc>
@@ -9433,7 +9433,7 @@
                 <w:b w:val="0"/>
                 <w:sz w:val="24"/>
               </w:rPr>
-              <w:t>Regular handwashing</w:t>
+              <w:t>Sharing food</w:t>
             </w:r>
           </w:p>
         </w:tc>
@@ -9453,7 +9453,7 @@
                 <w:b w:val="0"/>
                 <w:sz w:val="24"/>
               </w:rPr>
-              <w:t>+</w:t>
+              <w:t>-</w:t>
             </w:r>
           </w:p>
         </w:tc>
@@ -9650,7 +9650,7 @@
                 <w:b w:val="0"/>
                 <w:sz w:val="24"/>
               </w:rPr>
-              <w:t>thermometer</w:t>
+              <w:t>sphygmomanometer</w:t>
             </w:r>
           </w:p>
         </w:tc>
@@ -9670,7 +9670,7 @@
                 <w:b w:val="0"/>
                 <w:sz w:val="24"/>
               </w:rPr>
-              <w:t>-</w:t>
+              <w:t>+</w:t>
             </w:r>
           </w:p>
         </w:tc>
@@ -9713,7 +9713,7 @@
                 <w:b w:val="0"/>
                 <w:sz w:val="24"/>
               </w:rPr>
-              <w:t>sphygmomanometer</w:t>
+              <w:t>thermometer</w:t>
             </w:r>
           </w:p>
         </w:tc>
@@ -9733,7 +9733,7 @@
                 <w:b w:val="0"/>
                 <w:sz w:val="24"/>
               </w:rPr>
-              <w:t>+</w:t>
+              <w:t>-</w:t>
             </w:r>
           </w:p>
         </w:tc>
@@ -9930,7 +9930,7 @@
                 <w:b w:val="0"/>
                 <w:sz w:val="24"/>
               </w:rPr>
-              <w:t>Trees</w:t>
+              <w:t>Traffic</w:t>
             </w:r>
           </w:p>
         </w:tc>
@@ -9950,7 +9950,7 @@
                 <w:b w:val="0"/>
                 <w:sz w:val="24"/>
               </w:rPr>
-              <w:t>-</w:t>
+              <w:t>+</w:t>
             </w:r>
           </w:p>
         </w:tc>
@@ -9993,7 +9993,7 @@
                 <w:b w:val="0"/>
                 <w:sz w:val="24"/>
               </w:rPr>
-              <w:t>Traffic</w:t>
+              <w:t>Trees</w:t>
             </w:r>
           </w:p>
         </w:tc>
@@ -10013,7 +10013,7 @@
                 <w:b w:val="0"/>
                 <w:sz w:val="24"/>
               </w:rPr>
-              <w:t>+</w:t>
+              <w:t>-</w:t>
             </w:r>
           </w:p>
         </w:tc>
@@ -10210,7 +10210,7 @@
                 <w:b w:val="0"/>
                 <w:sz w:val="24"/>
               </w:rPr>
-              <w:t>carry oxygen</w:t>
+              <w:t>fight infection</w:t>
             </w:r>
           </w:p>
         </w:tc>
@@ -10230,7 +10230,7 @@
                 <w:b w:val="0"/>
                 <w:sz w:val="24"/>
               </w:rPr>
-              <w:t>-</w:t>
+              <w:t>+</w:t>
             </w:r>
           </w:p>
         </w:tc>
@@ -10273,7 +10273,7 @@
                 <w:b w:val="0"/>
                 <w:sz w:val="24"/>
               </w:rPr>
-              <w:t>fight infection</w:t>
+              <w:t>carry oxygen</w:t>
             </w:r>
           </w:p>
         </w:tc>
@@ -10293,7 +10293,7 @@
                 <w:b w:val="0"/>
                 <w:sz w:val="24"/>
               </w:rPr>
-              <w:t>+</w:t>
+              <w:t>-</w:t>
             </w:r>
           </w:p>
         </w:tc>
@@ -10490,7 +10490,7 @@
                 <w:b w:val="0"/>
                 <w:sz w:val="24"/>
               </w:rPr>
-              <w:t>Neurology</w:t>
+              <w:t>Cardiology</w:t>
             </w:r>
           </w:p>
         </w:tc>
@@ -10510,7 +10510,7 @@
                 <w:b w:val="0"/>
                 <w:sz w:val="24"/>
               </w:rPr>
-              <w:t>-</w:t>
+              <w:t>+</w:t>
             </w:r>
           </w:p>
         </w:tc>
@@ -10553,7 +10553,7 @@
                 <w:b w:val="0"/>
                 <w:sz w:val="24"/>
               </w:rPr>
-              <w:t>Cardiology</w:t>
+              <w:t>Neurology</w:t>
             </w:r>
           </w:p>
         </w:tc>
@@ -10573,7 +10573,7 @@
                 <w:b w:val="0"/>
                 <w:sz w:val="24"/>
               </w:rPr>
-              <w:t>+</w:t>
+              <w:t>-</w:t>
             </w:r>
           </w:p>
         </w:tc>
@@ -10770,7 +10770,7 @@
                 <w:b w:val="0"/>
                 <w:sz w:val="24"/>
               </w:rPr>
-              <w:t>ignoring symptoms</w:t>
+              <w:t>vaccination and hand hygiene</w:t>
             </w:r>
           </w:p>
         </w:tc>
@@ -10790,7 +10790,7 @@
                 <w:b w:val="0"/>
                 <w:sz w:val="24"/>
               </w:rPr>
-              <w:t>-</w:t>
+              <w:t>+</w:t>
             </w:r>
           </w:p>
         </w:tc>
@@ -10833,7 +10833,7 @@
                 <w:b w:val="0"/>
                 <w:sz w:val="24"/>
               </w:rPr>
-              <w:t>vaccination and hand hygiene</w:t>
+              <w:t>ignoring symptoms</w:t>
             </w:r>
           </w:p>
         </w:tc>
@@ -10853,7 +10853,7 @@
                 <w:b w:val="0"/>
                 <w:sz w:val="24"/>
               </w:rPr>
-              <w:t>+</w:t>
+              <w:t>-</w:t>
             </w:r>
           </w:p>
         </w:tc>
@@ -11330,7 +11330,7 @@
                 <w:b w:val="0"/>
                 <w:sz w:val="24"/>
               </w:rPr>
-              <w:t>nuclear power plants</w:t>
+              <w:t>medical imaging</w:t>
             </w:r>
           </w:p>
         </w:tc>
@@ -11350,7 +11350,7 @@
                 <w:b w:val="0"/>
                 <w:sz w:val="24"/>
               </w:rPr>
-              <w:t>-</w:t>
+              <w:t>+</w:t>
             </w:r>
           </w:p>
         </w:tc>
@@ -11393,7 +11393,7 @@
                 <w:b w:val="0"/>
                 <w:sz w:val="24"/>
               </w:rPr>
-              <w:t>medical imaging</w:t>
+              <w:t>nuclear power plants</w:t>
             </w:r>
           </w:p>
         </w:tc>
@@ -11413,7 +11413,7 @@
                 <w:b w:val="0"/>
                 <w:sz w:val="24"/>
               </w:rPr>
-              <w:t>+</w:t>
+              <w:t>-</w:t>
             </w:r>
           </w:p>
         </w:tc>
@@ -11610,7 +11610,7 @@
                 <w:b w:val="0"/>
                 <w:sz w:val="24"/>
               </w:rPr>
-              <w:t>Influenza</w:t>
+              <w:t>Diabetes</w:t>
             </w:r>
           </w:p>
         </w:tc>
@@ -11630,7 +11630,7 @@
                 <w:b w:val="0"/>
                 <w:sz w:val="24"/>
               </w:rPr>
-              <w:t>-</w:t>
+              <w:t>+</w:t>
             </w:r>
           </w:p>
         </w:tc>
@@ -11673,7 +11673,7 @@
                 <w:b w:val="0"/>
                 <w:sz w:val="24"/>
               </w:rPr>
-              <w:t>Diabetes</w:t>
+              <w:t>Influenza</w:t>
             </w:r>
           </w:p>
         </w:tc>
@@ -11693,7 +11693,7 @@
                 <w:b w:val="0"/>
                 <w:sz w:val="24"/>
               </w:rPr>
-              <w:t>+</w:t>
+              <w:t>-</w:t>
             </w:r>
           </w:p>
         </w:tc>
@@ -12450,7 +12450,7 @@
                 <w:b w:val="0"/>
                 <w:sz w:val="24"/>
               </w:rPr>
-              <w:t>punishment</w:t>
+              <w:t>education and awareness</w:t>
             </w:r>
           </w:p>
         </w:tc>
@@ -12470,7 +12470,7 @@
                 <w:b w:val="0"/>
                 <w:sz w:val="24"/>
               </w:rPr>
-              <w:t>-</w:t>
+              <w:t>+</w:t>
             </w:r>
           </w:p>
         </w:tc>
@@ -12513,7 +12513,7 @@
                 <w:b w:val="0"/>
                 <w:sz w:val="24"/>
               </w:rPr>
-              <w:t>education and awareness</w:t>
+              <w:t>punishment</w:t>
             </w:r>
           </w:p>
         </w:tc>
@@ -12533,7 +12533,7 @@
                 <w:b w:val="0"/>
                 <w:sz w:val="24"/>
               </w:rPr>
-              <w:t>+</w:t>
+              <w:t>-</w:t>
             </w:r>
           </w:p>
         </w:tc>
@@ -13010,7 +13010,7 @@
                 <w:b w:val="0"/>
                 <w:sz w:val="24"/>
               </w:rPr>
-              <w:t>carry oxygen</w:t>
+              <w:t>help blood clot</w:t>
             </w:r>
           </w:p>
         </w:tc>
@@ -13030,7 +13030,7 @@
                 <w:b w:val="0"/>
                 <w:sz w:val="24"/>
               </w:rPr>
-              <w:t>-</w:t>
+              <w:t>+</w:t>
             </w:r>
           </w:p>
         </w:tc>
@@ -13073,7 +13073,7 @@
                 <w:b w:val="0"/>
                 <w:sz w:val="24"/>
               </w:rPr>
-              <w:t>fight infection</w:t>
+              <w:t>carry oxygen</w:t>
             </w:r>
           </w:p>
         </w:tc>
@@ -13136,7 +13136,7 @@
                 <w:b w:val="0"/>
                 <w:sz w:val="24"/>
               </w:rPr>
-              <w:t>help blood clot</w:t>
+              <w:t>fight infection</w:t>
             </w:r>
           </w:p>
         </w:tc>
@@ -13156,7 +13156,7 @@
                 <w:b w:val="0"/>
                 <w:sz w:val="24"/>
               </w:rPr>
-              <w:t>+</w:t>
+              <w:t>-</w:t>
             </w:r>
           </w:p>
         </w:tc>
@@ -13290,7 +13290,7 @@
                 <w:b w:val="0"/>
                 <w:sz w:val="24"/>
               </w:rPr>
-              <w:t>Ministry of Finance</w:t>
+              <w:t>Rospotrebnadzor</w:t>
             </w:r>
           </w:p>
         </w:tc>
@@ -13310,7 +13310,7 @@
                 <w:b w:val="0"/>
                 <w:sz w:val="24"/>
               </w:rPr>
-              <w:t>-</w:t>
+              <w:t>+</w:t>
             </w:r>
           </w:p>
         </w:tc>
@@ -13353,7 +13353,7 @@
                 <w:b w:val="0"/>
                 <w:sz w:val="24"/>
               </w:rPr>
-              <w:t>Rospotrebnadzor</w:t>
+              <w:t>Ministry of Finance</w:t>
             </w:r>
           </w:p>
         </w:tc>
@@ -13373,7 +13373,7 @@
                 <w:b w:val="0"/>
                 <w:sz w:val="24"/>
               </w:rPr>
-              <w:t>+</w:t>
+              <w:t>-</w:t>
             </w:r>
           </w:p>
         </w:tc>
@@ -13570,7 +13570,7 @@
                 <w:b w:val="0"/>
                 <w:sz w:val="24"/>
               </w:rPr>
-              <w:t>fever only</w:t>
+              <w:t>nausea and vomiting</w:t>
             </w:r>
           </w:p>
         </w:tc>
@@ -13590,7 +13590,7 @@
                 <w:b w:val="0"/>
                 <w:sz w:val="24"/>
               </w:rPr>
-              <w:t>-</w:t>
+              <w:t>+</w:t>
             </w:r>
           </w:p>
         </w:tc>
@@ -13633,7 +13633,7 @@
                 <w:b w:val="0"/>
                 <w:sz w:val="24"/>
               </w:rPr>
-              <w:t>nausea and vomiting</w:t>
+              <w:t>fever only</w:t>
             </w:r>
           </w:p>
         </w:tc>
@@ -13653,7 +13653,7 @@
                 <w:b w:val="0"/>
                 <w:sz w:val="24"/>
               </w:rPr>
-              <w:t>+</w:t>
+              <w:t>-</w:t>
             </w:r>
           </w:p>
         </w:tc>
@@ -14130,7 +14130,7 @@
                 <w:b w:val="0"/>
                 <w:sz w:val="24"/>
               </w:rPr>
-              <w:t>tablet</w:t>
+              <w:t>inhaler</w:t>
             </w:r>
           </w:p>
         </w:tc>
@@ -14150,7 +14150,7 @@
                 <w:b w:val="0"/>
                 <w:sz w:val="24"/>
               </w:rPr>
-              <w:t>-</w:t>
+              <w:t>+</w:t>
             </w:r>
           </w:p>
         </w:tc>
@@ -14193,7 +14193,7 @@
                 <w:b w:val="0"/>
                 <w:sz w:val="24"/>
               </w:rPr>
-              <w:t>injection</w:t>
+              <w:t>tablet</w:t>
             </w:r>
           </w:p>
         </w:tc>
@@ -14256,7 +14256,7 @@
                 <w:b w:val="0"/>
                 <w:sz w:val="24"/>
               </w:rPr>
-              <w:t>inhaler</w:t>
+              <w:t>injection</w:t>
             </w:r>
           </w:p>
         </w:tc>
@@ -14276,7 +14276,7 @@
                 <w:b w:val="0"/>
                 <w:sz w:val="24"/>
               </w:rPr>
-              <w:t>+</w:t>
+              <w:t>-</w:t>
             </w:r>
           </w:p>
         </w:tc>
@@ -14410,7 +14410,7 @@
                 <w:b w:val="0"/>
                 <w:sz w:val="24"/>
               </w:rPr>
-              <w:t>lack of hospitals</w:t>
+              <w:t>antibiotic resistance</w:t>
             </w:r>
           </w:p>
         </w:tc>
@@ -14430,7 +14430,7 @@
                 <w:b w:val="0"/>
                 <w:sz w:val="24"/>
               </w:rPr>
-              <w:t>-</w:t>
+              <w:t>+</w:t>
             </w:r>
           </w:p>
         </w:tc>
@@ -14473,7 +14473,7 @@
                 <w:b w:val="0"/>
                 <w:sz w:val="24"/>
               </w:rPr>
-              <w:t>antibiotic resistance</w:t>
+              <w:t>lack of hospitals</w:t>
             </w:r>
           </w:p>
         </w:tc>
@@ -14493,7 +14493,7 @@
                 <w:b w:val="0"/>
                 <w:sz w:val="24"/>
               </w:rPr>
-              <w:t>+</w:t>
+              <w:t>-</w:t>
             </w:r>
           </w:p>
         </w:tc>
@@ -14690,7 +14690,7 @@
                 <w:b w:val="0"/>
                 <w:sz w:val="24"/>
               </w:rPr>
-              <w:t>Noise</w:t>
+              <w:t>Posture</w:t>
             </w:r>
           </w:p>
         </w:tc>
@@ -14710,7 +14710,7 @@
                 <w:b w:val="0"/>
                 <w:sz w:val="24"/>
               </w:rPr>
-              <w:t>-</w:t>
+              <w:t>+</w:t>
             </w:r>
           </w:p>
         </w:tc>
@@ -14753,7 +14753,7 @@
                 <w:b w:val="0"/>
                 <w:sz w:val="24"/>
               </w:rPr>
-              <w:t>Posture</w:t>
+              <w:t>Noise</w:t>
             </w:r>
           </w:p>
         </w:tc>
@@ -14773,7 +14773,7 @@
                 <w:b w:val="0"/>
                 <w:sz w:val="24"/>
               </w:rPr>
-              <w:t>+</w:t>
+              <w:t>-</w:t>
             </w:r>
           </w:p>
         </w:tc>
@@ -14970,7 +14970,7 @@
                 <w:b w:val="0"/>
                 <w:sz w:val="24"/>
               </w:rPr>
-              <w:t>plants</w:t>
+              <w:t>tobacco smoke</w:t>
             </w:r>
           </w:p>
         </w:tc>
@@ -14990,7 +14990,7 @@
                 <w:b w:val="0"/>
                 <w:sz w:val="24"/>
               </w:rPr>
-              <w:t>-</w:t>
+              <w:t>+</w:t>
             </w:r>
           </w:p>
         </w:tc>
@@ -15033,7 +15033,7 @@
                 <w:b w:val="0"/>
                 <w:sz w:val="24"/>
               </w:rPr>
-              <w:t>tobacco smoke</w:t>
+              <w:t>plants</w:t>
             </w:r>
           </w:p>
         </w:tc>
@@ -15053,7 +15053,7 @@
                 <w:b w:val="0"/>
                 <w:sz w:val="24"/>
               </w:rPr>
-              <w:t>+</w:t>
+              <w:t>-</w:t>
             </w:r>
           </w:p>
         </w:tc>
@@ -15250,7 +15250,7 @@
                 <w:b w:val="0"/>
                 <w:sz w:val="24"/>
               </w:rPr>
-              <w:t>Headache</w:t>
+              <w:t>Cancer</w:t>
             </w:r>
           </w:p>
         </w:tc>
@@ -15270,7 +15270,7 @@
                 <w:b w:val="0"/>
                 <w:sz w:val="24"/>
               </w:rPr>
-              <w:t>-</w:t>
+              <w:t>+</w:t>
             </w:r>
           </w:p>
         </w:tc>
@@ -15313,7 +15313,7 @@
                 <w:b w:val="0"/>
                 <w:sz w:val="24"/>
               </w:rPr>
-              <w:t>Cancer</w:t>
+              <w:t>Headache</w:t>
             </w:r>
           </w:p>
         </w:tc>
@@ -15333,7 +15333,7 @@
                 <w:b w:val="0"/>
                 <w:sz w:val="24"/>
               </w:rPr>
-              <w:t>+</w:t>
+              <w:t>-</w:t>
             </w:r>
           </w:p>
         </w:tc>
@@ -15530,7 +15530,7 @@
                 <w:b w:val="0"/>
                 <w:sz w:val="24"/>
               </w:rPr>
-              <w:t>digest food</w:t>
+              <w:t>pump blood</w:t>
             </w:r>
           </w:p>
         </w:tc>
@@ -15550,7 +15550,7 @@
                 <w:b w:val="0"/>
                 <w:sz w:val="24"/>
               </w:rPr>
-              <w:t>-</w:t>
+              <w:t>+</w:t>
             </w:r>
           </w:p>
         </w:tc>
@@ -15593,7 +15593,7 @@
                 <w:b w:val="0"/>
                 <w:sz w:val="24"/>
               </w:rPr>
-              <w:t>pump blood</w:t>
+              <w:t>digest food</w:t>
             </w:r>
           </w:p>
         </w:tc>
@@ -15613,7 +15613,7 @@
                 <w:b w:val="0"/>
                 <w:sz w:val="24"/>
               </w:rPr>
-              <w:t>+</w:t>
+              <w:t>-</w:t>
             </w:r>
           </w:p>
         </w:tc>
@@ -15810,7 +15810,7 @@
                 <w:b w:val="0"/>
                 <w:sz w:val="24"/>
               </w:rPr>
-              <w:t>Eating raw meat</w:t>
+              <w:t>Proper cooking and storage</w:t>
             </w:r>
           </w:p>
         </w:tc>
@@ -15830,7 +15830,7 @@
                 <w:b w:val="0"/>
                 <w:sz w:val="24"/>
               </w:rPr>
-              <w:t>-</w:t>
+              <w:t>+</w:t>
             </w:r>
           </w:p>
         </w:tc>
@@ -15873,7 +15873,7 @@
                 <w:b w:val="0"/>
                 <w:sz w:val="24"/>
               </w:rPr>
-              <w:t>Proper cooking and storage</w:t>
+              <w:t>Eating raw meat</w:t>
             </w:r>
           </w:p>
         </w:tc>
@@ -15893,7 +15893,7 @@
                 <w:b w:val="0"/>
                 <w:sz w:val="24"/>
               </w:rPr>
-              <w:t>+</w:t>
+              <w:t>-</w:t>
             </w:r>
           </w:p>
         </w:tc>
@@ -16090,7 +16090,7 @@
                 <w:b w:val="0"/>
                 <w:sz w:val="24"/>
               </w:rPr>
-              <w:t>schizophrenia</w:t>
+              <w:t>depression</w:t>
             </w:r>
           </w:p>
         </w:tc>
@@ -16110,7 +16110,7 @@
                 <w:b w:val="0"/>
                 <w:sz w:val="24"/>
               </w:rPr>
-              <w:t>-</w:t>
+              <w:t>+</w:t>
             </w:r>
           </w:p>
         </w:tc>
@@ -16153,7 +16153,7 @@
                 <w:b w:val="0"/>
                 <w:sz w:val="24"/>
               </w:rPr>
-              <w:t>depression</w:t>
+              <w:t>schizophrenia</w:t>
             </w:r>
           </w:p>
         </w:tc>
@@ -16173,7 +16173,7 @@
                 <w:b w:val="0"/>
                 <w:sz w:val="24"/>
               </w:rPr>
-              <w:t>+</w:t>
+              <w:t>-</w:t>
             </w:r>
           </w:p>
         </w:tc>
@@ -16650,7 +16650,7 @@
                 <w:b w:val="0"/>
                 <w:sz w:val="24"/>
               </w:rPr>
-              <w:t>noise</w:t>
+              <w:t>contaminated water</w:t>
             </w:r>
           </w:p>
         </w:tc>
@@ -16670,7 +16670,7 @@
                 <w:b w:val="0"/>
                 <w:sz w:val="24"/>
               </w:rPr>
-              <w:t>-</w:t>
+              <w:t>+</w:t>
             </w:r>
           </w:p>
         </w:tc>
@@ -16713,7 +16713,7 @@
                 <w:b w:val="0"/>
                 <w:sz w:val="24"/>
               </w:rPr>
-              <w:t>contaminated water</w:t>
+              <w:t>noise</w:t>
             </w:r>
           </w:p>
         </w:tc>
@@ -16733,7 +16733,7 @@
                 <w:b w:val="0"/>
                 <w:sz w:val="24"/>
               </w:rPr>
-              <w:t>+</w:t>
+              <w:t>-</w:t>
             </w:r>
           </w:p>
         </w:tc>
@@ -16930,7 +16930,7 @@
                 <w:b w:val="0"/>
                 <w:sz w:val="24"/>
               </w:rPr>
-              <w:t>Driving fast</w:t>
+              <w:t>Brushing teeth</w:t>
             </w:r>
           </w:p>
         </w:tc>
@@ -16950,7 +16950,7 @@
                 <w:b w:val="0"/>
                 <w:sz w:val="24"/>
               </w:rPr>
-              <w:t>-</w:t>
+              <w:t>+</w:t>
             </w:r>
           </w:p>
         </w:tc>
@@ -16993,7 +16993,7 @@
                 <w:b w:val="0"/>
                 <w:sz w:val="24"/>
               </w:rPr>
-              <w:t>Brushing teeth</w:t>
+              <w:t>Driving fast</w:t>
             </w:r>
           </w:p>
         </w:tc>
@@ -17013,7 +17013,7 @@
                 <w:b w:val="0"/>
                 <w:sz w:val="24"/>
               </w:rPr>
-              <w:t>+</w:t>
+              <w:t>-</w:t>
             </w:r>
           </w:p>
         </w:tc>
@@ -17490,7 +17490,7 @@
                 <w:b w:val="0"/>
                 <w:sz w:val="24"/>
               </w:rPr>
-              <w:t>Building hospitals</w:t>
+              <w:t>Waste management</w:t>
             </w:r>
           </w:p>
         </w:tc>
@@ -17510,7 +17510,7 @@
                 <w:b w:val="0"/>
                 <w:sz w:val="24"/>
               </w:rPr>
-              <w:t>-</w:t>
+              <w:t>+</w:t>
             </w:r>
           </w:p>
         </w:tc>
@@ -17553,7 +17553,7 @@
                 <w:b w:val="0"/>
                 <w:sz w:val="24"/>
               </w:rPr>
-              <w:t>Waste management</w:t>
+              <w:t>Building hospitals</w:t>
             </w:r>
           </w:p>
         </w:tc>
@@ -17573,7 +17573,7 @@
                 <w:b w:val="0"/>
                 <w:sz w:val="24"/>
               </w:rPr>
-              <w:t>+</w:t>
+              <w:t>-</w:t>
             </w:r>
           </w:p>
         </w:tc>
@@ -17770,7 +17770,7 @@
                 <w:b w:val="0"/>
                 <w:sz w:val="24"/>
               </w:rPr>
-              <w:t>diabetes</w:t>
+              <w:t>pneumonia</w:t>
             </w:r>
           </w:p>
         </w:tc>
@@ -17790,7 +17790,7 @@
                 <w:b w:val="0"/>
                 <w:sz w:val="24"/>
               </w:rPr>
-              <w:t>-</w:t>
+              <w:t>+</w:t>
             </w:r>
           </w:p>
         </w:tc>
@@ -17833,7 +17833,7 @@
                 <w:b w:val="0"/>
                 <w:sz w:val="24"/>
               </w:rPr>
-              <w:t>pneumonia</w:t>
+              <w:t>diabetes</w:t>
             </w:r>
           </w:p>
         </w:tc>
@@ -17853,7 +17853,7 @@
                 <w:b w:val="0"/>
                 <w:sz w:val="24"/>
               </w:rPr>
-              <w:t>+</w:t>
+              <w:t>-</w:t>
             </w:r>
           </w:p>
         </w:tc>
@@ -18050,7 +18050,7 @@
                 <w:b w:val="0"/>
                 <w:sz w:val="24"/>
               </w:rPr>
-              <w:t>Discounts</w:t>
+              <w:t>False advertising</w:t>
             </w:r>
           </w:p>
         </w:tc>
@@ -18070,7 +18070,7 @@
                 <w:b w:val="0"/>
                 <w:sz w:val="24"/>
               </w:rPr>
-              <w:t>-</w:t>
+              <w:t>+</w:t>
             </w:r>
           </w:p>
         </w:tc>
@@ -18113,7 +18113,7 @@
                 <w:b w:val="0"/>
                 <w:sz w:val="24"/>
               </w:rPr>
-              <w:t>False advertising</w:t>
+              <w:t>Discounts</w:t>
             </w:r>
           </w:p>
         </w:tc>
@@ -18133,7 +18133,7 @@
                 <w:b w:val="0"/>
                 <w:sz w:val="24"/>
               </w:rPr>
-              <w:t>+</w:t>
+              <w:t>-</w:t>
             </w:r>
           </w:p>
         </w:tc>
@@ -18330,7 +18330,7 @@
                 <w:b w:val="0"/>
                 <w:sz w:val="24"/>
               </w:rPr>
-              <w:t>using fewer ingredients</w:t>
+              <w:t>proper food storage and hand hygiene</w:t>
             </w:r>
           </w:p>
         </w:tc>
@@ -18350,7 +18350,7 @@
                 <w:b w:val="0"/>
                 <w:sz w:val="24"/>
               </w:rPr>
-              <w:t>-</w:t>
+              <w:t>+</w:t>
             </w:r>
           </w:p>
         </w:tc>
@@ -18393,7 +18393,7 @@
                 <w:b w:val="0"/>
                 <w:sz w:val="24"/>
               </w:rPr>
-              <w:t>proper food storage and hand hygiene</w:t>
+              <w:t>using fewer ingredients</w:t>
             </w:r>
           </w:p>
         </w:tc>
@@ -18413,7 +18413,7 @@
                 <w:b w:val="0"/>
                 <w:sz w:val="24"/>
               </w:rPr>
-              <w:t>+</w:t>
+              <w:t>-</w:t>
             </w:r>
           </w:p>
         </w:tc>
@@ -18610,7 +18610,7 @@
                 <w:b w:val="0"/>
                 <w:sz w:val="24"/>
               </w:rPr>
-              <w:t>Noise</w:t>
+              <w:t>High workload</w:t>
             </w:r>
           </w:p>
         </w:tc>
@@ -18630,7 +18630,7 @@
                 <w:b w:val="0"/>
                 <w:sz w:val="24"/>
               </w:rPr>
-              <w:t>-</w:t>
+              <w:t>+</w:t>
             </w:r>
           </w:p>
         </w:tc>
@@ -18673,7 +18673,7 @@
                 <w:b w:val="0"/>
                 <w:sz w:val="24"/>
               </w:rPr>
-              <w:t>High workload</w:t>
+              <w:t>Noise</w:t>
             </w:r>
           </w:p>
         </w:tc>
@@ -18693,7 +18693,7 @@
                 <w:b w:val="0"/>
                 <w:sz w:val="24"/>
               </w:rPr>
-              <w:t>+</w:t>
+              <w:t>-</w:t>
             </w:r>
           </w:p>
         </w:tc>
@@ -18890,7 +18890,7 @@
                 <w:b w:val="0"/>
                 <w:sz w:val="24"/>
               </w:rPr>
-              <w:t>pump blood</w:t>
+              <w:t>filter waste from blood</w:t>
             </w:r>
           </w:p>
         </w:tc>
@@ -18910,7 +18910,7 @@
                 <w:b w:val="0"/>
                 <w:sz w:val="24"/>
               </w:rPr>
-              <w:t>-</w:t>
+              <w:t>+</w:t>
             </w:r>
           </w:p>
         </w:tc>
@@ -18953,7 +18953,7 @@
                 <w:b w:val="0"/>
                 <w:sz w:val="24"/>
               </w:rPr>
-              <w:t>digest food</w:t>
+              <w:t>pump blood</w:t>
             </w:r>
           </w:p>
         </w:tc>
@@ -19016,7 +19016,7 @@
                 <w:b w:val="0"/>
                 <w:sz w:val="24"/>
               </w:rPr>
-              <w:t>filter waste from blood</w:t>
+              <w:t>digest food</w:t>
             </w:r>
           </w:p>
         </w:tc>
@@ -19036,7 +19036,7 @@
                 <w:b w:val="0"/>
                 <w:sz w:val="24"/>
               </w:rPr>
-              <w:t>+</w:t>
+              <w:t>-</w:t>
             </w:r>
           </w:p>
         </w:tc>
@@ -19170,7 +19170,7 @@
                 <w:b w:val="0"/>
                 <w:sz w:val="24"/>
               </w:rPr>
-              <w:t>Playing loud music</w:t>
+              <w:t>Using sound barriers</w:t>
             </w:r>
           </w:p>
         </w:tc>
@@ -19190,7 +19190,7 @@
                 <w:b w:val="0"/>
                 <w:sz w:val="24"/>
               </w:rPr>
-              <w:t>-</w:t>
+              <w:t>+</w:t>
             </w:r>
           </w:p>
         </w:tc>
@@ -19233,7 +19233,7 @@
                 <w:b w:val="0"/>
                 <w:sz w:val="24"/>
               </w:rPr>
-              <w:t>Using sound barriers</w:t>
+              <w:t>Playing loud music</w:t>
             </w:r>
           </w:p>
         </w:tc>
@@ -19253,7 +19253,7 @@
                 <w:b w:val="0"/>
                 <w:sz w:val="24"/>
               </w:rPr>
-              <w:t>+</w:t>
+              <w:t>-</w:t>
             </w:r>
           </w:p>
         </w:tc>
@@ -19450,7 +19450,7 @@
                 <w:b w:val="0"/>
                 <w:sz w:val="24"/>
               </w:rPr>
-              <w:t>genetics only</w:t>
+              <w:t>poor oral hygiene</w:t>
             </w:r>
           </w:p>
         </w:tc>
@@ -19470,7 +19470,7 @@
                 <w:b w:val="0"/>
                 <w:sz w:val="24"/>
               </w:rPr>
-              <w:t>-</w:t>
+              <w:t>+</w:t>
             </w:r>
           </w:p>
         </w:tc>
@@ -19513,7 +19513,7 @@
                 <w:b w:val="0"/>
                 <w:sz w:val="24"/>
               </w:rPr>
-              <w:t>poor oral hygiene</w:t>
+              <w:t>genetics only</w:t>
             </w:r>
           </w:p>
         </w:tc>
@@ -19533,7 +19533,7 @@
                 <w:b w:val="0"/>
                 <w:sz w:val="24"/>
               </w:rPr>
-              <w:t>+</w:t>
+              <w:t>-</w:t>
             </w:r>
           </w:p>
         </w:tc>
@@ -19730,7 +19730,7 @@
                 <w:b w:val="0"/>
                 <w:sz w:val="24"/>
               </w:rPr>
-              <w:t>MRI</w:t>
+              <w:t>X-ray</w:t>
             </w:r>
           </w:p>
         </w:tc>
@@ -19750,7 +19750,7 @@
                 <w:b w:val="0"/>
                 <w:sz w:val="24"/>
               </w:rPr>
-              <w:t>-</w:t>
+              <w:t>+</w:t>
             </w:r>
           </w:p>
         </w:tc>
@@ -19793,7 +19793,7 @@
                 <w:b w:val="0"/>
                 <w:sz w:val="24"/>
               </w:rPr>
-              <w:t>CT scan</w:t>
+              <w:t>MRI</w:t>
             </w:r>
           </w:p>
         </w:tc>
@@ -19856,7 +19856,7 @@
                 <w:b w:val="0"/>
                 <w:sz w:val="24"/>
               </w:rPr>
-              <w:t>X-ray</w:t>
+              <w:t>CT scan</w:t>
             </w:r>
           </w:p>
         </w:tc>
@@ -19876,7 +19876,7 @@
                 <w:b w:val="0"/>
                 <w:sz w:val="24"/>
               </w:rPr>
-              <w:t>+</w:t>
+              <w:t>-</w:t>
             </w:r>
           </w:p>
         </w:tc>
@@ -20290,7 +20290,7 @@
                 <w:b w:val="0"/>
                 <w:sz w:val="24"/>
               </w:rPr>
-              <w:t>Noise</w:t>
+              <w:t>Toxic fumes</w:t>
             </w:r>
           </w:p>
         </w:tc>
@@ -20310,7 +20310,7 @@
                 <w:b w:val="0"/>
                 <w:sz w:val="24"/>
               </w:rPr>
-              <w:t>-</w:t>
+              <w:t>+</w:t>
             </w:r>
           </w:p>
         </w:tc>
@@ -20353,7 +20353,7 @@
                 <w:b w:val="0"/>
                 <w:sz w:val="24"/>
               </w:rPr>
-              <w:t>Radiation</w:t>
+              <w:t>Noise</w:t>
             </w:r>
           </w:p>
         </w:tc>
@@ -20416,7 +20416,7 @@
                 <w:b w:val="0"/>
                 <w:sz w:val="24"/>
               </w:rPr>
-              <w:t>Toxic fumes</w:t>
+              <w:t>Radiation</w:t>
             </w:r>
           </w:p>
         </w:tc>
@@ -20436,7 +20436,7 @@
                 <w:b w:val="0"/>
                 <w:sz w:val="24"/>
               </w:rPr>
-              <w:t>+</w:t>
+              <w:t>-</w:t>
             </w:r>
           </w:p>
         </w:tc>
@@ -20570,7 +20570,7 @@
                 <w:b w:val="0"/>
                 <w:sz w:val="24"/>
               </w:rPr>
-              <w:t>burning more fuel</w:t>
+              <w:t>using renewable energy</w:t>
             </w:r>
           </w:p>
         </w:tc>
@@ -20590,7 +20590,7 @@
                 <w:b w:val="0"/>
                 <w:sz w:val="24"/>
               </w:rPr>
-              <w:t>-</w:t>
+              <w:t>+</w:t>
             </w:r>
           </w:p>
         </w:tc>
@@ -20633,7 +20633,7 @@
                 <w:b w:val="0"/>
                 <w:sz w:val="24"/>
               </w:rPr>
-              <w:t>using renewable energy</w:t>
+              <w:t>burning more fuel</w:t>
             </w:r>
           </w:p>
         </w:tc>
@@ -20653,7 +20653,7 @@
                 <w:b w:val="0"/>
                 <w:sz w:val="24"/>
               </w:rPr>
-              <w:t>+</w:t>
+              <w:t>-</w:t>
             </w:r>
           </w:p>
         </w:tc>
@@ -20850,7 +20850,7 @@
                 <w:b w:val="0"/>
                 <w:sz w:val="24"/>
               </w:rPr>
-              <w:t>Antibiotic</w:t>
+              <w:t>Antihypertensive</w:t>
             </w:r>
           </w:p>
         </w:tc>
@@ -20870,7 +20870,7 @@
                 <w:b w:val="0"/>
                 <w:sz w:val="24"/>
               </w:rPr>
-              <w:t>-</w:t>
+              <w:t>+</w:t>
             </w:r>
           </w:p>
         </w:tc>
@@ -20913,7 +20913,7 @@
                 <w:b w:val="0"/>
                 <w:sz w:val="24"/>
               </w:rPr>
-              <w:t>Antihypertensive</w:t>
+              <w:t>Antibiotic</w:t>
             </w:r>
           </w:p>
         </w:tc>
@@ -20933,7 +20933,7 @@
                 <w:b w:val="0"/>
                 <w:sz w:val="24"/>
               </w:rPr>
-              <w:t>+</w:t>
+              <w:t>-</w:t>
             </w:r>
           </w:p>
         </w:tc>
@@ -21130,7 +21130,7 @@
                 <w:b w:val="0"/>
                 <w:sz w:val="24"/>
               </w:rPr>
-              <w:t>music</w:t>
+              <w:t>prolonged noise exposure</w:t>
             </w:r>
           </w:p>
         </w:tc>
@@ -21150,7 +21150,7 @@
                 <w:b w:val="0"/>
                 <w:sz w:val="24"/>
               </w:rPr>
-              <w:t>-</w:t>
+              <w:t>+</w:t>
             </w:r>
           </w:p>
         </w:tc>
@@ -21193,7 +21193,7 @@
                 <w:b w:val="0"/>
                 <w:sz w:val="24"/>
               </w:rPr>
-              <w:t>stress</w:t>
+              <w:t>music</w:t>
             </w:r>
           </w:p>
         </w:tc>
@@ -21256,7 +21256,7 @@
                 <w:b w:val="0"/>
                 <w:sz w:val="24"/>
               </w:rPr>
-              <w:t>prolonged noise exposure</w:t>
+              <w:t>stress</w:t>
             </w:r>
           </w:p>
         </w:tc>
@@ -21276,7 +21276,7 @@
                 <w:b w:val="0"/>
                 <w:sz w:val="24"/>
               </w:rPr>
-              <w:t>+</w:t>
+              <w:t>-</w:t>
             </w:r>
           </w:p>
         </w:tc>
@@ -21410,7 +21410,7 @@
                 <w:b w:val="0"/>
                 <w:sz w:val="24"/>
               </w:rPr>
-              <w:t>Cardiology</w:t>
+              <w:t>Psychiatry</w:t>
             </w:r>
           </w:p>
         </w:tc>
@@ -21430,7 +21430,7 @@
                 <w:b w:val="0"/>
                 <w:sz w:val="24"/>
               </w:rPr>
-              <w:t>-</w:t>
+              <w:t>+</w:t>
             </w:r>
           </w:p>
         </w:tc>
@@ -21473,7 +21473,7 @@
                 <w:b w:val="0"/>
                 <w:sz w:val="24"/>
               </w:rPr>
-              <w:t>Dermatology</w:t>
+              <w:t>Cardiology</w:t>
             </w:r>
           </w:p>
         </w:tc>
@@ -21536,7 +21536,7 @@
                 <w:b w:val="0"/>
                 <w:sz w:val="24"/>
               </w:rPr>
-              <w:t>Psychiatry</w:t>
+              <w:t>Dermatology</w:t>
             </w:r>
           </w:p>
         </w:tc>
@@ -21556,7 +21556,7 @@
                 <w:b w:val="0"/>
                 <w:sz w:val="24"/>
               </w:rPr>
-              <w:t>+</w:t>
+              <w:t>-</w:t>
             </w:r>
           </w:p>
         </w:tc>
@@ -21690,7 +21690,7 @@
                 <w:b w:val="0"/>
                 <w:sz w:val="24"/>
               </w:rPr>
-              <w:t>closing schools</w:t>
+              <w:t>educating students about hygiene</w:t>
             </w:r>
           </w:p>
         </w:tc>
@@ -21710,7 +21710,7 @@
                 <w:b w:val="0"/>
                 <w:sz w:val="24"/>
               </w:rPr>
-              <w:t>-</w:t>
+              <w:t>+</w:t>
             </w:r>
           </w:p>
         </w:tc>
@@ -21753,7 +21753,7 @@
                 <w:b w:val="0"/>
                 <w:sz w:val="24"/>
               </w:rPr>
-              <w:t>educating students about hygiene</w:t>
+              <w:t>closing schools</w:t>
             </w:r>
           </w:p>
         </w:tc>
@@ -21773,7 +21773,7 @@
                 <w:b w:val="0"/>
                 <w:sz w:val="24"/>
               </w:rPr>
-              <w:t>+</w:t>
+              <w:t>-</w:t>
             </w:r>
           </w:p>
         </w:tc>
@@ -21970,7 +21970,7 @@
                 <w:b w:val="0"/>
                 <w:sz w:val="24"/>
               </w:rPr>
-              <w:t>Surgery</w:t>
+              <w:t>Herbal medicine</w:t>
             </w:r>
           </w:p>
         </w:tc>
@@ -21990,7 +21990,7 @@
                 <w:b w:val="0"/>
                 <w:sz w:val="24"/>
               </w:rPr>
-              <w:t>-</w:t>
+              <w:t>+</w:t>
             </w:r>
           </w:p>
         </w:tc>
@@ -22033,7 +22033,7 @@
                 <w:b w:val="0"/>
                 <w:sz w:val="24"/>
               </w:rPr>
-              <w:t>Herbal medicine</w:t>
+              <w:t>Surgery</w:t>
             </w:r>
           </w:p>
         </w:tc>
@@ -22053,7 +22053,7 @@
                 <w:b w:val="0"/>
                 <w:sz w:val="24"/>
               </w:rPr>
-              <w:t>+</w:t>
+              <w:t>-</w:t>
             </w:r>
           </w:p>
         </w:tc>
@@ -22250,7 +22250,7 @@
                 <w:b w:val="0"/>
                 <w:sz w:val="24"/>
               </w:rPr>
-              <w:t>pump blood</w:t>
+              <w:t>detoxify the body</w:t>
             </w:r>
           </w:p>
         </w:tc>
@@ -22270,7 +22270,7 @@
                 <w:b w:val="0"/>
                 <w:sz w:val="24"/>
               </w:rPr>
-              <w:t>-</w:t>
+              <w:t>+</w:t>
             </w:r>
           </w:p>
         </w:tc>
@@ -22313,7 +22313,7 @@
                 <w:b w:val="0"/>
                 <w:sz w:val="24"/>
               </w:rPr>
-              <w:t>detoxify the body</w:t>
+              <w:t>pump blood</w:t>
             </w:r>
           </w:p>
         </w:tc>
@@ -22333,7 +22333,7 @@
                 <w:b w:val="0"/>
                 <w:sz w:val="24"/>
               </w:rPr>
-              <w:t>+</w:t>
+              <w:t>-</w:t>
             </w:r>
           </w:p>
         </w:tc>
@@ -22530,7 +22530,7 @@
                 <w:b w:val="0"/>
                 <w:sz w:val="24"/>
               </w:rPr>
-              <w:t>Smoking</w:t>
+              <w:t>Using shielding</w:t>
             </w:r>
           </w:p>
         </w:tc>
@@ -22550,7 +22550,7 @@
                 <w:b w:val="0"/>
                 <w:sz w:val="24"/>
               </w:rPr>
-              <w:t>-</w:t>
+              <w:t>+</w:t>
             </w:r>
           </w:p>
         </w:tc>
@@ -22593,7 +22593,7 @@
                 <w:b w:val="0"/>
                 <w:sz w:val="24"/>
               </w:rPr>
-              <w:t>Using shielding</w:t>
+              <w:t>Smoking</w:t>
             </w:r>
           </w:p>
         </w:tc>
@@ -22613,7 +22613,7 @@
                 <w:b w:val="0"/>
                 <w:sz w:val="24"/>
               </w:rPr>
-              <w:t>+</w:t>
+              <w:t>-</w:t>
             </w:r>
           </w:p>
         </w:tc>
@@ -22810,7 +22810,7 @@
                 <w:b w:val="0"/>
                 <w:sz w:val="24"/>
               </w:rPr>
-              <w:t>poor diet</w:t>
+              <w:t>viruses and bacteria</w:t>
             </w:r>
           </w:p>
         </w:tc>
@@ -22830,7 +22830,7 @@
                 <w:b w:val="0"/>
                 <w:sz w:val="24"/>
               </w:rPr>
-              <w:t>-</w:t>
+              <w:t>+</w:t>
             </w:r>
           </w:p>
         </w:tc>
@@ -22873,7 +22873,7 @@
                 <w:b w:val="0"/>
                 <w:sz w:val="24"/>
               </w:rPr>
-              <w:t>viruses and bacteria</w:t>
+              <w:t>poor diet</w:t>
             </w:r>
           </w:p>
         </w:tc>
@@ -22893,7 +22893,7 @@
                 <w:b w:val="0"/>
                 <w:sz w:val="24"/>
               </w:rPr>
-              <w:t>+</w:t>
+              <w:t>-</w:t>
             </w:r>
           </w:p>
         </w:tc>
@@ -23090,7 +23090,7 @@
                 <w:b w:val="0"/>
                 <w:sz w:val="24"/>
               </w:rPr>
-              <w:t>Increasing prices</w:t>
+              <w:t>Product labelling</w:t>
             </w:r>
           </w:p>
         </w:tc>
@@ -23110,7 +23110,7 @@
                 <w:b w:val="0"/>
                 <w:sz w:val="24"/>
               </w:rPr>
-              <w:t>-</w:t>
+              <w:t>+</w:t>
             </w:r>
           </w:p>
         </w:tc>
@@ -23153,7 +23153,7 @@
                 <w:b w:val="0"/>
                 <w:sz w:val="24"/>
               </w:rPr>
-              <w:t>Product labelling</w:t>
+              <w:t>Increasing prices</w:t>
             </w:r>
           </w:p>
         </w:tc>
@@ -23173,7 +23173,7 @@
                 <w:b w:val="0"/>
                 <w:sz w:val="24"/>
               </w:rPr>
-              <w:t>+</w:t>
+              <w:t>-</w:t>
             </w:r>
           </w:p>
         </w:tc>
@@ -23370,7 +23370,7 @@
                 <w:b w:val="0"/>
                 <w:sz w:val="24"/>
               </w:rPr>
-              <w:t>increase pollution</w:t>
+              <w:t>promote public health</w:t>
             </w:r>
           </w:p>
         </w:tc>
@@ -23390,7 +23390,7 @@
                 <w:b w:val="0"/>
                 <w:sz w:val="24"/>
               </w:rPr>
-              <w:t>-</w:t>
+              <w:t>+</w:t>
             </w:r>
           </w:p>
         </w:tc>
@@ -23433,7 +23433,7 @@
                 <w:b w:val="0"/>
                 <w:sz w:val="24"/>
               </w:rPr>
-              <w:t>promote public health</w:t>
+              <w:t>increase pollution</w:t>
             </w:r>
           </w:p>
         </w:tc>
@@ -23453,7 +23453,7 @@
                 <w:b w:val="0"/>
                 <w:sz w:val="24"/>
               </w:rPr>
-              <w:t>+</w:t>
+              <w:t>-</w:t>
             </w:r>
           </w:p>
         </w:tc>

</xml_diff>